<commit_message>
Revise assessment package for HD traceability
</commit_message>
<xml_diff>
--- a/deliverables/final-submission/Cloudrest_Wines_Verification_Report.docx
+++ b/deliverables/final-submission/Cloudrest_Wines_Verification_Report.docx
@@ -41,7 +41,7 @@
           <w:color w:val="1B5E20"/>
           <w:sz w:val="26"/>
         </w:rPr>
-        <w:t>PASS — 31/31 checks passed</w:t>
+        <w:t>PASS — 64/64 checks passed</w:t>
       </w:r>
     </w:p>
     <w:p>
@@ -181,7 +181,7 @@
                 <w:rFonts w:ascii="Times New Roman" w:hAnsi="Times New Roman"/>
                 <w:sz w:val="20"/>
               </w:rPr>
-              <w:t>2026-08-16T22:18:34</w:t>
+              <w:t>2026-08-16T23:18:32</w:t>
             </w:r>
           </w:p>
         </w:tc>
@@ -568,7 +568,7 @@
                 <w:rFonts w:ascii="Times New Roman" w:hAnsi="Times New Roman"/>
                 <w:sz w:val="17"/>
               </w:rPr>
-              <w:t>Expected base tables</w:t>
+              <w:t>Schema statistics collected dynamically</w:t>
             </w:r>
           </w:p>
         </w:tc>
@@ -592,7 +592,7 @@
                 <w:rFonts w:ascii="Times New Roman" w:hAnsi="Times New Roman"/>
                 <w:sz w:val="17"/>
               </w:rPr>
-              <w:t>expected=53, actual=53</w:t>
+              <w:t>{'baseTables': 55, 'views': 1, 'columns': 282, 'foreignKeys': 72, 'checkConstraints': 48, 'triggers': 15, 'routines': 1}</w:t>
             </w:r>
           </w:p>
         </w:tc>
@@ -642,7 +642,7 @@
                 <w:rFonts w:ascii="Times New Roman" w:hAnsi="Times New Roman"/>
                 <w:sz w:val="17"/>
               </w:rPr>
-              <w:t>Expected views</w:t>
+              <w:t>supplieraddress exists</w:t>
             </w:r>
           </w:p>
         </w:tc>
@@ -666,7 +666,7 @@
                 <w:rFonts w:ascii="Times New Roman" w:hAnsi="Times New Roman"/>
                 <w:sz w:val="17"/>
               </w:rPr>
-              <w:t>expected=1, actual=1</w:t>
+              <w:t>['address', 'bottletype', 'businesscustomer', 'checkintopic', 'correctiveaction', 'customer', 'customeraddress', 'customerorder', 'customerphone', 'employee', 'employeeaddress', 'employeephone', 'employeequalification', 'employeerole', 'grapevariety', 'harvest', 'incident', 'incidentemployee', 'individualcustomer', 'medal', 'operationalarea', 'orderline', 'packmember', 'phone', 'pickerpack', 'productprice', 'purchaseorder', 'purchaseorderline', '</w:t>
             </w:r>
           </w:p>
         </w:tc>
@@ -716,7 +716,7 @@
                 <w:rFonts w:ascii="Times New Roman" w:hAnsi="Times New Roman"/>
                 <w:sz w:val="17"/>
               </w:rPr>
-              <w:t>Expected triggers</w:t>
+              <w:t>supplierphone exists</w:t>
             </w:r>
           </w:p>
         </w:tc>
@@ -740,7 +740,7 @@
                 <w:rFonts w:ascii="Times New Roman" w:hAnsi="Times New Roman"/>
                 <w:sz w:val="17"/>
               </w:rPr>
-              <w:t>expected=11, actual=11</w:t>
+              <w:t>['address', 'bottletype', 'businesscustomer', 'checkintopic', 'correctiveaction', 'customer', 'customeraddress', 'customerorder', 'customerphone', 'employee', 'employeeaddress', 'employeephone', 'employeequalification', 'employeerole', 'grapevariety', 'harvest', 'incident', 'incidentemployee', 'individualcustomer', 'medal', 'operationalarea', 'orderline', 'packmember', 'phone', 'pickerpack', 'productprice', 'purchaseorder', 'purchaseorderline', '</w:t>
             </w:r>
           </w:p>
         </w:tc>
@@ -790,7 +790,7 @@
                 <w:rFonts w:ascii="Times New Roman" w:hAnsi="Times New Roman"/>
                 <w:sz w:val="17"/>
               </w:rPr>
-              <w:t>Expected routines</w:t>
+              <w:t>Supplier direct redundant contact columns removed</w:t>
             </w:r>
           </w:p>
         </w:tc>
@@ -814,7 +814,7 @@
                 <w:rFonts w:ascii="Times New Roman" w:hAnsi="Times New Roman"/>
                 <w:sz w:val="17"/>
               </w:rPr>
-              <w:t>expected=1, actual=1</w:t>
+              <w:t>supplier.addressId/phoneNumber absent</w:t>
             </w:r>
           </w:p>
         </w:tc>
@@ -864,7 +864,7 @@
                 <w:rFonts w:ascii="Times New Roman" w:hAnsi="Times New Roman"/>
                 <w:sz w:val="17"/>
               </w:rPr>
-              <w:t>Expected columns</w:t>
+              <w:t>Employment classification separates type and pattern</w:t>
             </w:r>
           </w:p>
         </w:tc>
@@ -888,7 +888,7 @@
                 <w:rFonts w:ascii="Times New Roman" w:hAnsi="Times New Roman"/>
                 <w:sz w:val="17"/>
               </w:rPr>
-              <w:t>expected=274, actual=274</w:t>
+              <w:t>enum('PERMANENT','CASUAL'); enum('ONGOING','SEASONAL')</w:t>
             </w:r>
           </w:p>
         </w:tc>
@@ -938,377 +938,7 @@
                 <w:rFonts w:ascii="Times New Roman" w:hAnsi="Times New Roman"/>
                 <w:sz w:val="17"/>
               </w:rPr>
-              <w:t>Expected foreign keys</w:t>
-            </w:r>
-          </w:p>
-        </w:tc>
-        <w:tc>
-          <w:tcPr>
-            <w:tcW w:type="dxa" w:w="5060"/>
-            <w:vAlign w:val="center"/>
-            <w:tcMar>
-              <w:top w:w="80" w:type="dxa"/>
-              <w:start w:w="100" w:type="dxa"/>
-              <w:bottom w:w="80" w:type="dxa"/>
-              <w:end w:w="100" w:type="dxa"/>
-            </w:tcMar>
-          </w:tcPr>
-          <w:p>
-            <w:pPr>
-              <w:spacing w:after="0"/>
-            </w:pPr>
-            <w:r>
-              <w:rPr>
-                <w:rFonts w:ascii="Times New Roman" w:hAnsi="Times New Roman"/>
-                <w:sz w:val="17"/>
-              </w:rPr>
-              <w:t>expected=69, actual=69</w:t>
-            </w:r>
-          </w:p>
-        </w:tc>
-      </w:tr>
-      <w:tr>
-        <w:tc>
-          <w:tcPr>
-            <w:tcW w:type="dxa" w:w="900"/>
-            <w:vAlign w:val="center"/>
-            <w:tcMar>
-              <w:top w:w="80" w:type="dxa"/>
-              <w:start w:w="100" w:type="dxa"/>
-              <w:bottom w:w="80" w:type="dxa"/>
-              <w:end w:w="100" w:type="dxa"/>
-            </w:tcMar>
-          </w:tcPr>
-          <w:p>
-            <w:pPr>
-              <w:spacing w:after="0"/>
-            </w:pPr>
-            <w:r>
-              <w:rPr>
-                <w:rFonts w:ascii="Times New Roman" w:hAnsi="Times New Roman"/>
-                <w:sz w:val="17"/>
-              </w:rPr>
-              <w:t>PASS</w:t>
-            </w:r>
-          </w:p>
-        </w:tc>
-        <w:tc>
-          <w:tcPr>
-            <w:tcW w:type="dxa" w:w="3400"/>
-            <w:vAlign w:val="center"/>
-            <w:tcMar>
-              <w:top w:w="80" w:type="dxa"/>
-              <w:start w:w="100" w:type="dxa"/>
-              <w:bottom w:w="80" w:type="dxa"/>
-              <w:end w:w="100" w:type="dxa"/>
-            </w:tcMar>
-          </w:tcPr>
-          <w:p>
-            <w:pPr>
-              <w:spacing w:after="0"/>
-            </w:pPr>
-            <w:r>
-              <w:rPr>
-                <w:rFonts w:ascii="Times New Roman" w:hAnsi="Times New Roman"/>
-                <w:sz w:val="17"/>
-              </w:rPr>
-              <w:t>Expected check constraints</w:t>
-            </w:r>
-          </w:p>
-        </w:tc>
-        <w:tc>
-          <w:tcPr>
-            <w:tcW w:type="dxa" w:w="5060"/>
-            <w:vAlign w:val="center"/>
-            <w:tcMar>
-              <w:top w:w="80" w:type="dxa"/>
-              <w:start w:w="100" w:type="dxa"/>
-              <w:bottom w:w="80" w:type="dxa"/>
-              <w:end w:w="100" w:type="dxa"/>
-            </w:tcMar>
-          </w:tcPr>
-          <w:p>
-            <w:pPr>
-              <w:spacing w:after="0"/>
-            </w:pPr>
-            <w:r>
-              <w:rPr>
-                <w:rFonts w:ascii="Times New Roman" w:hAnsi="Times New Roman"/>
-                <w:sz w:val="17"/>
-              </w:rPr>
-              <w:t>expected=47, actual=47</w:t>
-            </w:r>
-          </w:p>
-        </w:tc>
-      </w:tr>
-      <w:tr>
-        <w:tc>
-          <w:tcPr>
-            <w:tcW w:type="dxa" w:w="900"/>
-            <w:vAlign w:val="center"/>
-            <w:tcMar>
-              <w:top w:w="80" w:type="dxa"/>
-              <w:start w:w="100" w:type="dxa"/>
-              <w:bottom w:w="80" w:type="dxa"/>
-              <w:end w:w="100" w:type="dxa"/>
-            </w:tcMar>
-          </w:tcPr>
-          <w:p>
-            <w:pPr>
-              <w:spacing w:after="0"/>
-            </w:pPr>
-            <w:r>
-              <w:rPr>
-                <w:rFonts w:ascii="Times New Roman" w:hAnsi="Times New Roman"/>
-                <w:sz w:val="17"/>
-              </w:rPr>
-              <w:t>PASS</w:t>
-            </w:r>
-          </w:p>
-        </w:tc>
-        <w:tc>
-          <w:tcPr>
-            <w:tcW w:type="dxa" w:w="3400"/>
-            <w:vAlign w:val="center"/>
-            <w:tcMar>
-              <w:top w:w="80" w:type="dxa"/>
-              <w:start w:w="100" w:type="dxa"/>
-              <w:bottom w:w="80" w:type="dxa"/>
-              <w:end w:w="100" w:type="dxa"/>
-            </w:tcMar>
-          </w:tcPr>
-          <w:p>
-            <w:pPr>
-              <w:spacing w:after="0"/>
-            </w:pPr>
-            <w:r>
-              <w:rPr>
-                <w:rFonts w:ascii="Times New Roman" w:hAnsi="Times New Roman"/>
-                <w:sz w:val="17"/>
-              </w:rPr>
-              <w:t>Table names are lowercase without spaces/underscores</w:t>
-            </w:r>
-          </w:p>
-        </w:tc>
-        <w:tc>
-          <w:tcPr>
-            <w:tcW w:type="dxa" w:w="5060"/>
-            <w:vAlign w:val="center"/>
-            <w:tcMar>
-              <w:top w:w="80" w:type="dxa"/>
-              <w:start w:w="100" w:type="dxa"/>
-              <w:bottom w:w="80" w:type="dxa"/>
-              <w:end w:w="100" w:type="dxa"/>
-            </w:tcMar>
-          </w:tcPr>
-          <w:p>
-            <w:pPr>
-              <w:spacing w:after="0"/>
-            </w:pPr>
-            <w:r>
-              <w:rPr>
-                <w:rFonts w:ascii="Times New Roman" w:hAnsi="Times New Roman"/>
-                <w:sz w:val="17"/>
-              </w:rPr>
-              <w:t>53 compliant names</w:t>
-            </w:r>
-          </w:p>
-        </w:tc>
-      </w:tr>
-      <w:tr>
-        <w:tc>
-          <w:tcPr>
-            <w:tcW w:type="dxa" w:w="900"/>
-            <w:vAlign w:val="center"/>
-            <w:tcMar>
-              <w:top w:w="80" w:type="dxa"/>
-              <w:start w:w="100" w:type="dxa"/>
-              <w:bottom w:w="80" w:type="dxa"/>
-              <w:end w:w="100" w:type="dxa"/>
-            </w:tcMar>
-          </w:tcPr>
-          <w:p>
-            <w:pPr>
-              <w:spacing w:after="0"/>
-            </w:pPr>
-            <w:r>
-              <w:rPr>
-                <w:rFonts w:ascii="Times New Roman" w:hAnsi="Times New Roman"/>
-                <w:sz w:val="17"/>
-              </w:rPr>
-              <w:t>PASS</w:t>
-            </w:r>
-          </w:p>
-        </w:tc>
-        <w:tc>
-          <w:tcPr>
-            <w:tcW w:type="dxa" w:w="3400"/>
-            <w:vAlign w:val="center"/>
-            <w:tcMar>
-              <w:top w:w="80" w:type="dxa"/>
-              <w:start w:w="100" w:type="dxa"/>
-              <w:bottom w:w="80" w:type="dxa"/>
-              <w:end w:w="100" w:type="dxa"/>
-            </w:tcMar>
-          </w:tcPr>
-          <w:p>
-            <w:pPr>
-              <w:spacing w:after="0"/>
-            </w:pPr>
-            <w:r>
-              <w:rPr>
-                <w:rFonts w:ascii="Times New Roman" w:hAnsi="Times New Roman"/>
-                <w:sz w:val="17"/>
-              </w:rPr>
-              <w:t>Attributes use lowerCamelCase-compatible names</w:t>
-            </w:r>
-          </w:p>
-        </w:tc>
-        <w:tc>
-          <w:tcPr>
-            <w:tcW w:type="dxa" w:w="5060"/>
-            <w:vAlign w:val="center"/>
-            <w:tcMar>
-              <w:top w:w="80" w:type="dxa"/>
-              <w:start w:w="100" w:type="dxa"/>
-              <w:bottom w:w="80" w:type="dxa"/>
-              <w:end w:w="100" w:type="dxa"/>
-            </w:tcMar>
-          </w:tcPr>
-          <w:p>
-            <w:pPr>
-              <w:spacing w:after="0"/>
-            </w:pPr>
-            <w:r>
-              <w:rPr>
-                <w:rFonts w:ascii="Times New Roman" w:hAnsi="Times New Roman"/>
-                <w:sz w:val="17"/>
-              </w:rPr>
-              <w:t>274 compliant names</w:t>
-            </w:r>
-          </w:p>
-        </w:tc>
-      </w:tr>
-      <w:tr>
-        <w:tc>
-          <w:tcPr>
-            <w:tcW w:type="dxa" w:w="900"/>
-            <w:vAlign w:val="center"/>
-            <w:tcMar>
-              <w:top w:w="80" w:type="dxa"/>
-              <w:start w:w="100" w:type="dxa"/>
-              <w:bottom w:w="80" w:type="dxa"/>
-              <w:end w:w="100" w:type="dxa"/>
-            </w:tcMar>
-          </w:tcPr>
-          <w:p>
-            <w:pPr>
-              <w:spacing w:after="0"/>
-            </w:pPr>
-            <w:r>
-              <w:rPr>
-                <w:rFonts w:ascii="Times New Roman" w:hAnsi="Times New Roman"/>
-                <w:sz w:val="17"/>
-              </w:rPr>
-              <w:t>PASS</w:t>
-            </w:r>
-          </w:p>
-        </w:tc>
-        <w:tc>
-          <w:tcPr>
-            <w:tcW w:type="dxa" w:w="3400"/>
-            <w:vAlign w:val="center"/>
-            <w:tcMar>
-              <w:top w:w="80" w:type="dxa"/>
-              <w:start w:w="100" w:type="dxa"/>
-              <w:bottom w:w="80" w:type="dxa"/>
-              <w:end w:w="100" w:type="dxa"/>
-            </w:tcMar>
-          </w:tcPr>
-          <w:p>
-            <w:pPr>
-              <w:spacing w:after="0"/>
-            </w:pPr>
-            <w:r>
-              <w:rPr>
-                <w:rFonts w:ascii="Times New Roman" w:hAnsi="Times New Roman"/>
-                <w:sz w:val="17"/>
-              </w:rPr>
-              <w:t>Every base table has a primary key</w:t>
-            </w:r>
-          </w:p>
-        </w:tc>
-        <w:tc>
-          <w:tcPr>
-            <w:tcW w:type="dxa" w:w="5060"/>
-            <w:vAlign w:val="center"/>
-            <w:tcMar>
-              <w:top w:w="80" w:type="dxa"/>
-              <w:start w:w="100" w:type="dxa"/>
-              <w:bottom w:w="80" w:type="dxa"/>
-              <w:end w:w="100" w:type="dxa"/>
-            </w:tcMar>
-          </w:tcPr>
-          <w:p>
-            <w:pPr>
-              <w:spacing w:after="0"/>
-            </w:pPr>
-            <w:r>
-              <w:rPr>
-                <w:rFonts w:ascii="Times New Roman" w:hAnsi="Times New Roman"/>
-                <w:sz w:val="17"/>
-              </w:rPr>
-              <w:t>all 53 tables</w:t>
-            </w:r>
-          </w:p>
-        </w:tc>
-      </w:tr>
-      <w:tr>
-        <w:tc>
-          <w:tcPr>
-            <w:tcW w:type="dxa" w:w="900"/>
-            <w:vAlign w:val="center"/>
-            <w:tcMar>
-              <w:top w:w="80" w:type="dxa"/>
-              <w:start w:w="100" w:type="dxa"/>
-              <w:bottom w:w="80" w:type="dxa"/>
-              <w:end w:w="100" w:type="dxa"/>
-            </w:tcMar>
-          </w:tcPr>
-          <w:p>
-            <w:pPr>
-              <w:spacing w:after="0"/>
-            </w:pPr>
-            <w:r>
-              <w:rPr>
-                <w:rFonts w:ascii="Times New Roman" w:hAnsi="Times New Roman"/>
-                <w:sz w:val="17"/>
-              </w:rPr>
-              <w:t>PASS</w:t>
-            </w:r>
-          </w:p>
-        </w:tc>
-        <w:tc>
-          <w:tcPr>
-            <w:tcW w:type="dxa" w:w="3400"/>
-            <w:vAlign w:val="center"/>
-            <w:tcMar>
-              <w:top w:w="80" w:type="dxa"/>
-              <w:start w:w="100" w:type="dxa"/>
-              <w:bottom w:w="80" w:type="dxa"/>
-              <w:end w:w="100" w:type="dxa"/>
-            </w:tcMar>
-          </w:tcPr>
-          <w:p>
-            <w:pPr>
-              <w:spacing w:after="0"/>
-            </w:pPr>
-            <w:r>
-              <w:rPr>
-                <w:rFonts w:ascii="Times New Roman" w:hAnsi="Times New Roman"/>
-                <w:sz w:val="17"/>
-              </w:rPr>
-              <w:t>No picking pack has fewer than four active members</w:t>
+              <w:t>Seasonal pickers are CASUAL + SEASONAL</w:t>
             </w:r>
           </w:p>
         </w:tc>
@@ -1382,7 +1012,155 @@
                 <w:rFonts w:ascii="Times New Roman" w:hAnsi="Times New Roman"/>
                 <w:sz w:val="17"/>
               </w:rPr>
-              <w:t>All wine compositions total 100 percent</w:t>
+              <w:t>Vineyard constraint is positive-only</w:t>
+            </w:r>
+          </w:p>
+        </w:tc>
+        <w:tc>
+          <w:tcPr>
+            <w:tcW w:type="dxa" w:w="5060"/>
+            <w:vAlign w:val="center"/>
+            <w:tcMar>
+              <w:top w:w="80" w:type="dxa"/>
+              <w:start w:w="100" w:type="dxa"/>
+              <w:bottom w:w="80" w:type="dxa"/>
+              <w:end w:w="100" w:type="dxa"/>
+            </w:tcMar>
+          </w:tcPr>
+          <w:p>
+            <w:pPr>
+              <w:spacing w:after="0"/>
+            </w:pPr>
+            <w:r>
+              <w:rPr>
+                <w:rFonts w:ascii="Times New Roman" w:hAnsi="Times New Roman"/>
+                <w:sz w:val="17"/>
+              </w:rPr>
+              <w:t>positive-only</w:t>
+            </w:r>
+          </w:p>
+        </w:tc>
+      </w:tr>
+      <w:tr>
+        <w:tc>
+          <w:tcPr>
+            <w:tcW w:type="dxa" w:w="900"/>
+            <w:vAlign w:val="center"/>
+            <w:tcMar>
+              <w:top w:w="80" w:type="dxa"/>
+              <w:start w:w="100" w:type="dxa"/>
+              <w:bottom w:w="80" w:type="dxa"/>
+              <w:end w:w="100" w:type="dxa"/>
+            </w:tcMar>
+          </w:tcPr>
+          <w:p>
+            <w:pPr>
+              <w:spacing w:after="0"/>
+            </w:pPr>
+            <w:r>
+              <w:rPr>
+                <w:rFonts w:ascii="Times New Roman" w:hAnsi="Times New Roman"/>
+                <w:sz w:val="17"/>
+              </w:rPr>
+              <w:t>PASS</w:t>
+            </w:r>
+          </w:p>
+        </w:tc>
+        <w:tc>
+          <w:tcPr>
+            <w:tcW w:type="dxa" w:w="3400"/>
+            <w:vAlign w:val="center"/>
+            <w:tcMar>
+              <w:top w:w="80" w:type="dxa"/>
+              <w:start w:w="100" w:type="dxa"/>
+              <w:bottom w:w="80" w:type="dxa"/>
+              <w:end w:w="100" w:type="dxa"/>
+            </w:tcMar>
+          </w:tcPr>
+          <w:p>
+            <w:pPr>
+              <w:spacing w:after="0"/>
+            </w:pPr>
+            <w:r>
+              <w:rPr>
+                <w:rFonts w:ascii="Times New Roman" w:hAnsi="Times New Roman"/>
+                <w:sz w:val="17"/>
+              </w:rPr>
+              <w:t>Severity does not require positive lost hours</w:t>
+            </w:r>
+          </w:p>
+        </w:tc>
+        <w:tc>
+          <w:tcPr>
+            <w:tcW w:type="dxa" w:w="5060"/>
+            <w:vAlign w:val="center"/>
+            <w:tcMar>
+              <w:top w:w="80" w:type="dxa"/>
+              <w:start w:w="100" w:type="dxa"/>
+              <w:bottom w:w="80" w:type="dxa"/>
+              <w:end w:w="100" w:type="dxa"/>
+            </w:tcMar>
+          </w:tcPr>
+          <w:p>
+            <w:pPr>
+              <w:spacing w:after="0"/>
+            </w:pPr>
+            <w:r>
+              <w:rPr>
+                <w:rFonts w:ascii="Times New Roman" w:hAnsi="Times New Roman"/>
+                <w:sz w:val="17"/>
+              </w:rPr>
+              <w:t>unsupported constraint absent</w:t>
+            </w:r>
+          </w:p>
+        </w:tc>
+      </w:tr>
+      <w:tr>
+        <w:tc>
+          <w:tcPr>
+            <w:tcW w:type="dxa" w:w="900"/>
+            <w:vAlign w:val="center"/>
+            <w:tcMar>
+              <w:top w:w="80" w:type="dxa"/>
+              <w:start w:w="100" w:type="dxa"/>
+              <w:bottom w:w="80" w:type="dxa"/>
+              <w:end w:w="100" w:type="dxa"/>
+            </w:tcMar>
+          </w:tcPr>
+          <w:p>
+            <w:pPr>
+              <w:spacing w:after="0"/>
+            </w:pPr>
+            <w:r>
+              <w:rPr>
+                <w:rFonts w:ascii="Times New Roman" w:hAnsi="Times New Roman"/>
+                <w:sz w:val="17"/>
+              </w:rPr>
+              <w:t>PASS</w:t>
+            </w:r>
+          </w:p>
+        </w:tc>
+        <w:tc>
+          <w:tcPr>
+            <w:tcW w:type="dxa" w:w="3400"/>
+            <w:vAlign w:val="center"/>
+            <w:tcMar>
+              <w:top w:w="80" w:type="dxa"/>
+              <w:start w:w="100" w:type="dxa"/>
+              <w:bottom w:w="80" w:type="dxa"/>
+              <w:end w:w="100" w:type="dxa"/>
+            </w:tcMar>
+          </w:tcPr>
+          <w:p>
+            <w:pPr>
+              <w:spacing w:after="0"/>
+            </w:pPr>
+            <w:r>
+              <w:rPr>
+                <w:rFonts w:ascii="Times New Roman" w:hAnsi="Times New Roman"/>
+                <w:sz w:val="17"/>
+              </w:rPr>
+              <w:t>Every employee has one current physical address</w:t>
             </w:r>
           </w:p>
         </w:tc>
@@ -1456,7 +1234,7 @@
                 <w:rFonts w:ascii="Times New Roman" w:hAnsi="Times New Roman"/>
                 <w:sz w:val="17"/>
               </w:rPr>
-              <w:t>No employee has multiple active role rows</w:t>
+              <w:t>Every employee has exactly one current primary phone</w:t>
             </w:r>
           </w:p>
         </w:tc>
@@ -1530,7 +1308,7 @@
                 <w:rFonts w:ascii="Times New Roman" w:hAnsi="Times New Roman"/>
                 <w:sz w:val="17"/>
               </w:rPr>
-              <w:t>No employee has multiple active supervisors</w:t>
+              <w:t>Supplier address history exists</w:t>
             </w:r>
           </w:p>
         </w:tc>
@@ -1604,7 +1382,7 @@
                 <w:rFonts w:ascii="Times New Roman" w:hAnsi="Times New Roman"/>
                 <w:sz w:val="17"/>
               </w:rPr>
-              <w:t>Completed training has completion and competency</w:t>
+              <w:t>Supplier phone history exists</w:t>
             </w:r>
           </w:p>
         </w:tc>
@@ -1678,7 +1456,7 @@
                 <w:rFonts w:ascii="Times New Roman" w:hAnsi="Times New Roman"/>
                 <w:sz w:val="17"/>
               </w:rPr>
-              <w:t>No non-reorder bottle lacks a comment</w:t>
+              <w:t>Employee role history example exists</w:t>
             </w:r>
           </w:p>
         </w:tc>
@@ -1752,7 +1530,7 @@
                 <w:rFonts w:ascii="Times New Roman" w:hAnsi="Times New Roman"/>
                 <w:sz w:val="17"/>
               </w:rPr>
-              <w:t>No shipment uses a postal address</w:t>
+              <w:t>Supervisor history example exists</w:t>
             </w:r>
           </w:p>
         </w:tc>
@@ -1826,7 +1604,7 @@
                 <w:rFonts w:ascii="Times New Roman" w:hAnsi="Times New Roman"/>
                 <w:sz w:val="17"/>
               </w:rPr>
-              <w:t>No shipped order is unpaid</w:t>
+              <w:t>Employee address history example exists</w:t>
             </w:r>
           </w:p>
         </w:tc>
@@ -1900,7 +1678,7 @@
                 <w:rFonts w:ascii="Times New Roman" w:hAnsi="Times New Roman"/>
                 <w:sz w:val="17"/>
               </w:rPr>
-              <w:t>Query script executes: 01_trainingcoverage.sql</w:t>
+              <w:t>Employee phone history example exists</w:t>
             </w:r>
           </w:p>
         </w:tc>
@@ -1924,7 +1702,7 @@
                 <w:rFonts w:ascii="Times New Roman" w:hAnsi="Times New Roman"/>
                 <w:sz w:val="17"/>
               </w:rPr>
-              <w:t xml:space="preserve">exitCode=0, outputChars=114; </w:t>
+              <w:t>violations=0</w:t>
             </w:r>
           </w:p>
         </w:tc>
@@ -1974,7 +1752,7 @@
                 <w:rFonts w:ascii="Times New Roman" w:hAnsi="Times New Roman"/>
                 <w:sz w:val="17"/>
               </w:rPr>
-              <w:t>Query script executes: 02_incidentrate.sql</w:t>
+              <w:t>No multiple current roles</w:t>
             </w:r>
           </w:p>
         </w:tc>
@@ -1998,7 +1776,7 @@
                 <w:rFonts w:ascii="Times New Roman" w:hAnsi="Times New Roman"/>
                 <w:sz w:val="17"/>
               </w:rPr>
-              <w:t xml:space="preserve">exitCode=0, outputChars=122; </w:t>
+              <w:t>violations=0</w:t>
             </w:r>
           </w:p>
         </w:tc>
@@ -2048,7 +1826,7 @@
                 <w:rFonts w:ascii="Times New Roman" w:hAnsi="Times New Roman"/>
                 <w:sz w:val="17"/>
               </w:rPr>
-              <w:t>Query script executes: 03_trainingimpact.sql</w:t>
+              <w:t>No multiple current supervisors</w:t>
             </w:r>
           </w:p>
         </w:tc>
@@ -2072,7 +1850,7 @@
                 <w:rFonts w:ascii="Times New Roman" w:hAnsi="Times New Roman"/>
                 <w:sz w:val="17"/>
               </w:rPr>
-              <w:t xml:space="preserve">exitCode=0, outputChars=239; </w:t>
+              <w:t>violations=0</w:t>
             </w:r>
           </w:p>
         </w:tc>
@@ -2122,7 +1900,7 @@
                 <w:rFonts w:ascii="Times New Roman" w:hAnsi="Times New Roman"/>
                 <w:sz w:val="17"/>
               </w:rPr>
-              <w:t>Query script executes: 04_overtimerisk.sql</w:t>
+              <w:t>No invalid shipment address</w:t>
             </w:r>
           </w:p>
         </w:tc>
@@ -2146,7 +1924,7 @@
                 <w:rFonts w:ascii="Times New Roman" w:hAnsi="Times New Roman"/>
                 <w:sz w:val="17"/>
               </w:rPr>
-              <w:t xml:space="preserve">exitCode=0, outputChars=422; </w:t>
+              <w:t>violations=0</w:t>
             </w:r>
           </w:p>
         </w:tc>
@@ -2196,7 +1974,7 @@
                 <w:rFonts w:ascii="Times New Roman" w:hAnsi="Times New Roman"/>
                 <w:sz w:val="17"/>
               </w:rPr>
-              <w:t>Query script executes: 05_expiringqualification.sql</w:t>
+              <w:t>No shipped unpaid order</w:t>
             </w:r>
           </w:p>
         </w:tc>
@@ -2220,7 +1998,7 @@
                 <w:rFonts w:ascii="Times New Roman" w:hAnsi="Times New Roman"/>
                 <w:sz w:val="17"/>
               </w:rPr>
-              <w:t xml:space="preserve">exitCode=0, outputChars=347; </w:t>
+              <w:t>violations=0</w:t>
             </w:r>
           </w:p>
         </w:tc>
@@ -2270,7 +2048,7 @@
                 <w:rFonts w:ascii="Times New Roman" w:hAnsi="Times New Roman"/>
                 <w:sz w:val="17"/>
               </w:rPr>
-              <w:t>Query script executes: 06_openactions.sql</w:t>
+              <w:t>Query executes: 01_trainingcoverage.sql</w:t>
             </w:r>
           </w:p>
         </w:tc>
@@ -2294,7 +2072,7 @@
                 <w:rFonts w:ascii="Times New Roman" w:hAnsi="Times New Roman"/>
                 <w:sz w:val="17"/>
               </w:rPr>
-              <w:t xml:space="preserve">exitCode=0, outputChars=971; </w:t>
+              <w:t xml:space="preserve">exit=0, chars=114, </w:t>
             </w:r>
           </w:p>
         </w:tc>
@@ -2344,7 +2122,7 @@
                 <w:rFonts w:ascii="Times New Roman" w:hAnsi="Times New Roman"/>
                 <w:sz w:val="17"/>
               </w:rPr>
-              <w:t>Integrity test behaves as expected: t01_validtraining.sql</w:t>
+              <w:t>Query executes: 02_incidentrate.sql</w:t>
             </w:r>
           </w:p>
         </w:tc>
@@ -2368,7 +2146,377 @@
                 <w:rFonts w:ascii="Times New Roman" w:hAnsi="Times New Roman"/>
                 <w:sz w:val="17"/>
               </w:rPr>
-              <w:t>exitCode=0, expectedNeedle=PASS, output=testResult</w:t>
+              <w:t xml:space="preserve">exit=0, chars=122, </w:t>
+            </w:r>
+          </w:p>
+        </w:tc>
+      </w:tr>
+      <w:tr>
+        <w:tc>
+          <w:tcPr>
+            <w:tcW w:type="dxa" w:w="900"/>
+            <w:vAlign w:val="center"/>
+            <w:tcMar>
+              <w:top w:w="80" w:type="dxa"/>
+              <w:start w:w="100" w:type="dxa"/>
+              <w:bottom w:w="80" w:type="dxa"/>
+              <w:end w:w="100" w:type="dxa"/>
+            </w:tcMar>
+          </w:tcPr>
+          <w:p>
+            <w:pPr>
+              <w:spacing w:after="0"/>
+            </w:pPr>
+            <w:r>
+              <w:rPr>
+                <w:rFonts w:ascii="Times New Roman" w:hAnsi="Times New Roman"/>
+                <w:sz w:val="17"/>
+              </w:rPr>
+              <w:t>PASS</w:t>
+            </w:r>
+          </w:p>
+        </w:tc>
+        <w:tc>
+          <w:tcPr>
+            <w:tcW w:type="dxa" w:w="3400"/>
+            <w:vAlign w:val="center"/>
+            <w:tcMar>
+              <w:top w:w="80" w:type="dxa"/>
+              <w:start w:w="100" w:type="dxa"/>
+              <w:bottom w:w="80" w:type="dxa"/>
+              <w:end w:w="100" w:type="dxa"/>
+            </w:tcMar>
+          </w:tcPr>
+          <w:p>
+            <w:pPr>
+              <w:spacing w:after="0"/>
+            </w:pPr>
+            <w:r>
+              <w:rPr>
+                <w:rFonts w:ascii="Times New Roman" w:hAnsi="Times New Roman"/>
+                <w:sz w:val="17"/>
+              </w:rPr>
+              <w:t>Query executes: 03_trainingimpact.sql</w:t>
+            </w:r>
+          </w:p>
+        </w:tc>
+        <w:tc>
+          <w:tcPr>
+            <w:tcW w:type="dxa" w:w="5060"/>
+            <w:vAlign w:val="center"/>
+            <w:tcMar>
+              <w:top w:w="80" w:type="dxa"/>
+              <w:start w:w="100" w:type="dxa"/>
+              <w:bottom w:w="80" w:type="dxa"/>
+              <w:end w:w="100" w:type="dxa"/>
+            </w:tcMar>
+          </w:tcPr>
+          <w:p>
+            <w:pPr>
+              <w:spacing w:after="0"/>
+            </w:pPr>
+            <w:r>
+              <w:rPr>
+                <w:rFonts w:ascii="Times New Roman" w:hAnsi="Times New Roman"/>
+                <w:sz w:val="17"/>
+              </w:rPr>
+              <w:t xml:space="preserve">exit=0, chars=239, </w:t>
+            </w:r>
+          </w:p>
+        </w:tc>
+      </w:tr>
+      <w:tr>
+        <w:tc>
+          <w:tcPr>
+            <w:tcW w:type="dxa" w:w="900"/>
+            <w:vAlign w:val="center"/>
+            <w:tcMar>
+              <w:top w:w="80" w:type="dxa"/>
+              <w:start w:w="100" w:type="dxa"/>
+              <w:bottom w:w="80" w:type="dxa"/>
+              <w:end w:w="100" w:type="dxa"/>
+            </w:tcMar>
+          </w:tcPr>
+          <w:p>
+            <w:pPr>
+              <w:spacing w:after="0"/>
+            </w:pPr>
+            <w:r>
+              <w:rPr>
+                <w:rFonts w:ascii="Times New Roman" w:hAnsi="Times New Roman"/>
+                <w:sz w:val="17"/>
+              </w:rPr>
+              <w:t>PASS</w:t>
+            </w:r>
+          </w:p>
+        </w:tc>
+        <w:tc>
+          <w:tcPr>
+            <w:tcW w:type="dxa" w:w="3400"/>
+            <w:vAlign w:val="center"/>
+            <w:tcMar>
+              <w:top w:w="80" w:type="dxa"/>
+              <w:start w:w="100" w:type="dxa"/>
+              <w:bottom w:w="80" w:type="dxa"/>
+              <w:end w:w="100" w:type="dxa"/>
+            </w:tcMar>
+          </w:tcPr>
+          <w:p>
+            <w:pPr>
+              <w:spacing w:after="0"/>
+            </w:pPr>
+            <w:r>
+              <w:rPr>
+                <w:rFonts w:ascii="Times New Roman" w:hAnsi="Times New Roman"/>
+                <w:sz w:val="17"/>
+              </w:rPr>
+              <w:t>Query executes: 04_overtimerisk.sql</w:t>
+            </w:r>
+          </w:p>
+        </w:tc>
+        <w:tc>
+          <w:tcPr>
+            <w:tcW w:type="dxa" w:w="5060"/>
+            <w:vAlign w:val="center"/>
+            <w:tcMar>
+              <w:top w:w="80" w:type="dxa"/>
+              <w:start w:w="100" w:type="dxa"/>
+              <w:bottom w:w="80" w:type="dxa"/>
+              <w:end w:w="100" w:type="dxa"/>
+            </w:tcMar>
+          </w:tcPr>
+          <w:p>
+            <w:pPr>
+              <w:spacing w:after="0"/>
+            </w:pPr>
+            <w:r>
+              <w:rPr>
+                <w:rFonts w:ascii="Times New Roman" w:hAnsi="Times New Roman"/>
+                <w:sz w:val="17"/>
+              </w:rPr>
+              <w:t xml:space="preserve">exit=0, chars=422, </w:t>
+            </w:r>
+          </w:p>
+        </w:tc>
+      </w:tr>
+      <w:tr>
+        <w:tc>
+          <w:tcPr>
+            <w:tcW w:type="dxa" w:w="900"/>
+            <w:vAlign w:val="center"/>
+            <w:tcMar>
+              <w:top w:w="80" w:type="dxa"/>
+              <w:start w:w="100" w:type="dxa"/>
+              <w:bottom w:w="80" w:type="dxa"/>
+              <w:end w:w="100" w:type="dxa"/>
+            </w:tcMar>
+          </w:tcPr>
+          <w:p>
+            <w:pPr>
+              <w:spacing w:after="0"/>
+            </w:pPr>
+            <w:r>
+              <w:rPr>
+                <w:rFonts w:ascii="Times New Roman" w:hAnsi="Times New Roman"/>
+                <w:sz w:val="17"/>
+              </w:rPr>
+              <w:t>PASS</w:t>
+            </w:r>
+          </w:p>
+        </w:tc>
+        <w:tc>
+          <w:tcPr>
+            <w:tcW w:type="dxa" w:w="3400"/>
+            <w:vAlign w:val="center"/>
+            <w:tcMar>
+              <w:top w:w="80" w:type="dxa"/>
+              <w:start w:w="100" w:type="dxa"/>
+              <w:bottom w:w="80" w:type="dxa"/>
+              <w:end w:w="100" w:type="dxa"/>
+            </w:tcMar>
+          </w:tcPr>
+          <w:p>
+            <w:pPr>
+              <w:spacing w:after="0"/>
+            </w:pPr>
+            <w:r>
+              <w:rPr>
+                <w:rFonts w:ascii="Times New Roman" w:hAnsi="Times New Roman"/>
+                <w:sz w:val="17"/>
+              </w:rPr>
+              <w:t>Query executes: 05_expiringqualification.sql</w:t>
+            </w:r>
+          </w:p>
+        </w:tc>
+        <w:tc>
+          <w:tcPr>
+            <w:tcW w:type="dxa" w:w="5060"/>
+            <w:vAlign w:val="center"/>
+            <w:tcMar>
+              <w:top w:w="80" w:type="dxa"/>
+              <w:start w:w="100" w:type="dxa"/>
+              <w:bottom w:w="80" w:type="dxa"/>
+              <w:end w:w="100" w:type="dxa"/>
+            </w:tcMar>
+          </w:tcPr>
+          <w:p>
+            <w:pPr>
+              <w:spacing w:after="0"/>
+            </w:pPr>
+            <w:r>
+              <w:rPr>
+                <w:rFonts w:ascii="Times New Roman" w:hAnsi="Times New Roman"/>
+                <w:sz w:val="17"/>
+              </w:rPr>
+              <w:t xml:space="preserve">exit=0, chars=347, </w:t>
+            </w:r>
+          </w:p>
+        </w:tc>
+      </w:tr>
+      <w:tr>
+        <w:tc>
+          <w:tcPr>
+            <w:tcW w:type="dxa" w:w="900"/>
+            <w:vAlign w:val="center"/>
+            <w:tcMar>
+              <w:top w:w="80" w:type="dxa"/>
+              <w:start w:w="100" w:type="dxa"/>
+              <w:bottom w:w="80" w:type="dxa"/>
+              <w:end w:w="100" w:type="dxa"/>
+            </w:tcMar>
+          </w:tcPr>
+          <w:p>
+            <w:pPr>
+              <w:spacing w:after="0"/>
+            </w:pPr>
+            <w:r>
+              <w:rPr>
+                <w:rFonts w:ascii="Times New Roman" w:hAnsi="Times New Roman"/>
+                <w:sz w:val="17"/>
+              </w:rPr>
+              <w:t>PASS</w:t>
+            </w:r>
+          </w:p>
+        </w:tc>
+        <w:tc>
+          <w:tcPr>
+            <w:tcW w:type="dxa" w:w="3400"/>
+            <w:vAlign w:val="center"/>
+            <w:tcMar>
+              <w:top w:w="80" w:type="dxa"/>
+              <w:start w:w="100" w:type="dxa"/>
+              <w:bottom w:w="80" w:type="dxa"/>
+              <w:end w:w="100" w:type="dxa"/>
+            </w:tcMar>
+          </w:tcPr>
+          <w:p>
+            <w:pPr>
+              <w:spacing w:after="0"/>
+            </w:pPr>
+            <w:r>
+              <w:rPr>
+                <w:rFonts w:ascii="Times New Roman" w:hAnsi="Times New Roman"/>
+                <w:sz w:val="17"/>
+              </w:rPr>
+              <w:t>Query executes: 06_openactions.sql</w:t>
+            </w:r>
+          </w:p>
+        </w:tc>
+        <w:tc>
+          <w:tcPr>
+            <w:tcW w:type="dxa" w:w="5060"/>
+            <w:vAlign w:val="center"/>
+            <w:tcMar>
+              <w:top w:w="80" w:type="dxa"/>
+              <w:start w:w="100" w:type="dxa"/>
+              <w:bottom w:w="80" w:type="dxa"/>
+              <w:end w:w="100" w:type="dxa"/>
+            </w:tcMar>
+          </w:tcPr>
+          <w:p>
+            <w:pPr>
+              <w:spacing w:after="0"/>
+            </w:pPr>
+            <w:r>
+              <w:rPr>
+                <w:rFonts w:ascii="Times New Roman" w:hAnsi="Times New Roman"/>
+                <w:sz w:val="17"/>
+              </w:rPr>
+              <w:t xml:space="preserve">exit=0, chars=971, </w:t>
+            </w:r>
+          </w:p>
+        </w:tc>
+      </w:tr>
+      <w:tr>
+        <w:tc>
+          <w:tcPr>
+            <w:tcW w:type="dxa" w:w="900"/>
+            <w:vAlign w:val="center"/>
+            <w:tcMar>
+              <w:top w:w="80" w:type="dxa"/>
+              <w:start w:w="100" w:type="dxa"/>
+              <w:bottom w:w="80" w:type="dxa"/>
+              <w:end w:w="100" w:type="dxa"/>
+            </w:tcMar>
+          </w:tcPr>
+          <w:p>
+            <w:pPr>
+              <w:spacing w:after="0"/>
+            </w:pPr>
+            <w:r>
+              <w:rPr>
+                <w:rFonts w:ascii="Times New Roman" w:hAnsi="Times New Roman"/>
+                <w:sz w:val="17"/>
+              </w:rPr>
+              <w:t>PASS</w:t>
+            </w:r>
+          </w:p>
+        </w:tc>
+        <w:tc>
+          <w:tcPr>
+            <w:tcW w:type="dxa" w:w="3400"/>
+            <w:vAlign w:val="center"/>
+            <w:tcMar>
+              <w:top w:w="80" w:type="dxa"/>
+              <w:start w:w="100" w:type="dxa"/>
+              <w:bottom w:w="80" w:type="dxa"/>
+              <w:end w:w="100" w:type="dxa"/>
+            </w:tcMar>
+          </w:tcPr>
+          <w:p>
+            <w:pPr>
+              <w:spacing w:after="0"/>
+            </w:pPr>
+            <w:r>
+              <w:rPr>
+                <w:rFonts w:ascii="Times New Roman" w:hAnsi="Times New Roman"/>
+                <w:sz w:val="17"/>
+              </w:rPr>
+              <w:t>Assessed integrity test: t01_validtraining.sql</w:t>
+            </w:r>
+          </w:p>
+        </w:tc>
+        <w:tc>
+          <w:tcPr>
+            <w:tcW w:type="dxa" w:w="5060"/>
+            <w:vAlign w:val="center"/>
+            <w:tcMar>
+              <w:top w:w="80" w:type="dxa"/>
+              <w:start w:w="100" w:type="dxa"/>
+              <w:bottom w:w="80" w:type="dxa"/>
+              <w:end w:w="100" w:type="dxa"/>
+            </w:tcMar>
+          </w:tcPr>
+          <w:p>
+            <w:pPr>
+              <w:spacing w:after="0"/>
+            </w:pPr>
+            <w:r>
+              <w:rPr>
+                <w:rFonts w:ascii="Times New Roman" w:hAnsi="Times New Roman"/>
+                <w:sz w:val="17"/>
+              </w:rPr>
+              <w:t>exit=0; expected=PASS; testResult</w:t>
               <w:br/>
               <w:t>PASS: valid completed training was accepted</w:t>
             </w:r>
@@ -2420,7 +2568,7 @@
                 <w:rFonts w:ascii="Times New Roman" w:hAnsi="Times New Roman"/>
                 <w:sz w:val="17"/>
               </w:rPr>
-              <w:t>Integrity test behaves as expected: t02_invalidroledate.sql</w:t>
+              <w:t>Assessed integrity test: t02_invalidroledate.sql</w:t>
             </w:r>
           </w:p>
         </w:tc>
@@ -2444,7 +2592,7 @@
                 <w:rFonts w:ascii="Times New Roman" w:hAnsi="Times New Roman"/>
                 <w:sz w:val="17"/>
               </w:rPr>
-              <w:t>exitCode=1, expectedNeedle=chk_employeerole_dates, output=ERROR 3819 (HY000) at line 3: Check constraint 'chk_employeerole_dates' is violated.</w:t>
+              <w:t>exit=1; expected=chk_employeerole_dates; ERROR 3819 (HY000) at line 3: Check constraint 'chk_employeerole_dates' is violated.</w:t>
             </w:r>
           </w:p>
         </w:tc>
@@ -2494,7 +2642,7 @@
                 <w:rFonts w:ascii="Times New Roman" w:hAnsi="Times New Roman"/>
                 <w:sz w:val="17"/>
               </w:rPr>
-              <w:t>Integrity test behaves as expected: t03_missingreordercomment.sql</w:t>
+              <w:t>Assessed integrity test: t03_missingreordercomment.sql</w:t>
             </w:r>
           </w:p>
         </w:tc>
@@ -2518,7 +2666,7 @@
                 <w:rFonts w:ascii="Times New Roman" w:hAnsi="Times New Roman"/>
                 <w:sz w:val="17"/>
               </w:rPr>
-              <w:t>exitCode=1, expectedNeedle=chk_bottletype_reorder, output=ERROR 3819 (HY000) at line 2: Check constraint 'chk_bottletype_reorder' is violated.</w:t>
+              <w:t>exit=1; expected=chk_bottletype_reorder; ERROR 3819 (HY000) at line 2: Check constraint 'chk_bottletype_reorder' is violated.</w:t>
             </w:r>
           </w:p>
         </w:tc>
@@ -2568,7 +2716,7 @@
                 <w:rFonts w:ascii="Times New Roman" w:hAnsi="Times New Roman"/>
                 <w:sz w:val="17"/>
               </w:rPr>
-              <w:t>Integrity test behaves as expected: t04_underagecustomer.sql</w:t>
+              <w:t>Assessed integrity test: t04_unpaidshipment.sql</w:t>
             </w:r>
           </w:p>
         </w:tc>
@@ -2592,7 +2740,7 @@
                 <w:rFonts w:ascii="Times New Roman" w:hAnsi="Times New Roman"/>
                 <w:sz w:val="17"/>
               </w:rPr>
-              <w:t>exitCode=1, expectedNeedle=Individual customer must be at least 18 years old, output=ERROR 1644 (45000) at line 3: Individual customer must be at least 18 years old</w:t>
+              <w:t>exit=1; expected=Order must be paid before shipment; ERROR 1644 (45000) at line 4: Order must be paid before shipment</w:t>
             </w:r>
           </w:p>
         </w:tc>
@@ -2642,7 +2790,7 @@
                 <w:rFonts w:ascii="Times New Roman" w:hAnsi="Times New Roman"/>
                 <w:sz w:val="17"/>
               </w:rPr>
-              <w:t>Integrity test behaves as expected: t05_postalshipment.sql</w:t>
+              <w:t>Assessed integrity test: t05_overlappingsupervision.sql</w:t>
             </w:r>
           </w:p>
         </w:tc>
@@ -2666,7 +2814,7 @@
                 <w:rFonts w:ascii="Times New Roman" w:hAnsi="Times New Roman"/>
                 <w:sz w:val="17"/>
               </w:rPr>
-              <w:t>exitCode=1, expectedNeedle=Shipment address must be a physical address, output=ERROR 1644 (45000) at line 4: Shipment address must be a physical address, not PO Box or Private Bag</w:t>
+              <w:t>exit=1; expected=already has a supervisor; ERROR 1644 (45000) at line 3: Employee already has a supervisor during this period</w:t>
             </w:r>
           </w:p>
         </w:tc>
@@ -2716,7 +2864,7 @@
                 <w:rFonts w:ascii="Times New Roman" w:hAnsi="Times New Roman"/>
                 <w:sz w:val="17"/>
               </w:rPr>
-              <w:t>Integrity test behaves as expected: t06_invalidconversionpercentage.sql</w:t>
+              <w:t>Assessed business rule: Rule 1 role dates</w:t>
             </w:r>
           </w:p>
         </w:tc>
@@ -2740,7 +2888,2301 @@
                 <w:rFonts w:ascii="Times New Roman" w:hAnsi="Times New Roman"/>
                 <w:sz w:val="17"/>
               </w:rPr>
-              <w:t>exitCode=1, expectedNeedle=chk_grapevariety_conversion, output=ERROR 3819 (HY000) at line 3: Check constraint 'chk_grapevariety_conversion' is violated.</w:t>
+              <w:t>t02_invalidroledate.sql; ERROR 3819 (HY000) at line 3: Check constraint 'chk_employeerole_dates' is violated.</w:t>
+            </w:r>
+          </w:p>
+        </w:tc>
+      </w:tr>
+      <w:tr>
+        <w:tc>
+          <w:tcPr>
+            <w:tcW w:type="dxa" w:w="900"/>
+            <w:vAlign w:val="center"/>
+            <w:tcMar>
+              <w:top w:w="80" w:type="dxa"/>
+              <w:start w:w="100" w:type="dxa"/>
+              <w:bottom w:w="80" w:type="dxa"/>
+              <w:end w:w="100" w:type="dxa"/>
+            </w:tcMar>
+          </w:tcPr>
+          <w:p>
+            <w:pPr>
+              <w:spacing w:after="0"/>
+            </w:pPr>
+            <w:r>
+              <w:rPr>
+                <w:rFonts w:ascii="Times New Roman" w:hAnsi="Times New Roman"/>
+                <w:sz w:val="17"/>
+              </w:rPr>
+              <w:t>PASS</w:t>
+            </w:r>
+          </w:p>
+        </w:tc>
+        <w:tc>
+          <w:tcPr>
+            <w:tcW w:type="dxa" w:w="3400"/>
+            <w:vAlign w:val="center"/>
+            <w:tcMar>
+              <w:top w:w="80" w:type="dxa"/>
+              <w:start w:w="100" w:type="dxa"/>
+              <w:bottom w:w="80" w:type="dxa"/>
+              <w:end w:w="100" w:type="dxa"/>
+            </w:tcMar>
+          </w:tcPr>
+          <w:p>
+            <w:pPr>
+              <w:spacing w:after="0"/>
+            </w:pPr>
+            <w:r>
+              <w:rPr>
+                <w:rFonts w:ascii="Times New Roman" w:hAnsi="Times New Roman"/>
+                <w:sz w:val="17"/>
+              </w:rPr>
+              <w:t>Assessed business rule: Rule 2 reorder comment</w:t>
+            </w:r>
+          </w:p>
+        </w:tc>
+        <w:tc>
+          <w:tcPr>
+            <w:tcW w:type="dxa" w:w="5060"/>
+            <w:vAlign w:val="center"/>
+            <w:tcMar>
+              <w:top w:w="80" w:type="dxa"/>
+              <w:start w:w="100" w:type="dxa"/>
+              <w:bottom w:w="80" w:type="dxa"/>
+              <w:end w:w="100" w:type="dxa"/>
+            </w:tcMar>
+          </w:tcPr>
+          <w:p>
+            <w:pPr>
+              <w:spacing w:after="0"/>
+            </w:pPr>
+            <w:r>
+              <w:rPr>
+                <w:rFonts w:ascii="Times New Roman" w:hAnsi="Times New Roman"/>
+                <w:sz w:val="17"/>
+              </w:rPr>
+              <w:t>t03_missingreordercomment.sql; ERROR 3819 (HY000) at line 2: Check constraint 'chk_bottletype_reorder' is violated.</w:t>
+            </w:r>
+          </w:p>
+        </w:tc>
+      </w:tr>
+      <w:tr>
+        <w:tc>
+          <w:tcPr>
+            <w:tcW w:type="dxa" w:w="900"/>
+            <w:vAlign w:val="center"/>
+            <w:tcMar>
+              <w:top w:w="80" w:type="dxa"/>
+              <w:start w:w="100" w:type="dxa"/>
+              <w:bottom w:w="80" w:type="dxa"/>
+              <w:end w:w="100" w:type="dxa"/>
+            </w:tcMar>
+          </w:tcPr>
+          <w:p>
+            <w:pPr>
+              <w:spacing w:after="0"/>
+            </w:pPr>
+            <w:r>
+              <w:rPr>
+                <w:rFonts w:ascii="Times New Roman" w:hAnsi="Times New Roman"/>
+                <w:sz w:val="17"/>
+              </w:rPr>
+              <w:t>PASS</w:t>
+            </w:r>
+          </w:p>
+        </w:tc>
+        <w:tc>
+          <w:tcPr>
+            <w:tcW w:type="dxa" w:w="3400"/>
+            <w:vAlign w:val="center"/>
+            <w:tcMar>
+              <w:top w:w="80" w:type="dxa"/>
+              <w:start w:w="100" w:type="dxa"/>
+              <w:bottom w:w="80" w:type="dxa"/>
+              <w:end w:w="100" w:type="dxa"/>
+            </w:tcMar>
+          </w:tcPr>
+          <w:p>
+            <w:pPr>
+              <w:spacing w:after="0"/>
+            </w:pPr>
+            <w:r>
+              <w:rPr>
+                <w:rFonts w:ascii="Times New Roman" w:hAnsi="Times New Roman"/>
+                <w:sz w:val="17"/>
+              </w:rPr>
+              <w:t>Assessed business rule: Rule 3 current physical address</w:t>
+            </w:r>
+          </w:p>
+        </w:tc>
+        <w:tc>
+          <w:tcPr>
+            <w:tcW w:type="dxa" w:w="5060"/>
+            <w:vAlign w:val="center"/>
+            <w:tcMar>
+              <w:top w:w="80" w:type="dxa"/>
+              <w:start w:w="100" w:type="dxa"/>
+              <w:bottom w:w="80" w:type="dxa"/>
+              <w:end w:w="100" w:type="dxa"/>
+            </w:tcMar>
+          </w:tcPr>
+          <w:p>
+            <w:pPr>
+              <w:spacing w:after="0"/>
+            </w:pPr>
+            <w:r>
+              <w:rPr>
+                <w:rFonts w:ascii="Times New Roman" w:hAnsi="Times New Roman"/>
+                <w:sz w:val="17"/>
+              </w:rPr>
+              <w:t>additional_postalshipment.sql; ERROR 1644 (45000) at line 3: Shipment address must be a physical address, not PO Box or Private Bag</w:t>
+            </w:r>
+          </w:p>
+        </w:tc>
+      </w:tr>
+      <w:tr>
+        <w:tc>
+          <w:tcPr>
+            <w:tcW w:type="dxa" w:w="900"/>
+            <w:vAlign w:val="center"/>
+            <w:tcMar>
+              <w:top w:w="80" w:type="dxa"/>
+              <w:start w:w="100" w:type="dxa"/>
+              <w:bottom w:w="80" w:type="dxa"/>
+              <w:end w:w="100" w:type="dxa"/>
+            </w:tcMar>
+          </w:tcPr>
+          <w:p>
+            <w:pPr>
+              <w:spacing w:after="0"/>
+            </w:pPr>
+            <w:r>
+              <w:rPr>
+                <w:rFonts w:ascii="Times New Roman" w:hAnsi="Times New Roman"/>
+                <w:sz w:val="17"/>
+              </w:rPr>
+              <w:t>PASS</w:t>
+            </w:r>
+          </w:p>
+        </w:tc>
+        <w:tc>
+          <w:tcPr>
+            <w:tcW w:type="dxa" w:w="3400"/>
+            <w:vAlign w:val="center"/>
+            <w:tcMar>
+              <w:top w:w="80" w:type="dxa"/>
+              <w:start w:w="100" w:type="dxa"/>
+              <w:bottom w:w="80" w:type="dxa"/>
+              <w:end w:w="100" w:type="dxa"/>
+            </w:tcMar>
+          </w:tcPr>
+          <w:p>
+            <w:pPr>
+              <w:spacing w:after="0"/>
+            </w:pPr>
+            <w:r>
+              <w:rPr>
+                <w:rFonts w:ascii="Times New Roman" w:hAnsi="Times New Roman"/>
+                <w:sz w:val="17"/>
+              </w:rPr>
+              <w:t>Assessed business rule: Rule 4 paid before shipment</w:t>
+            </w:r>
+          </w:p>
+        </w:tc>
+        <w:tc>
+          <w:tcPr>
+            <w:tcW w:type="dxa" w:w="5060"/>
+            <w:vAlign w:val="center"/>
+            <w:tcMar>
+              <w:top w:w="80" w:type="dxa"/>
+              <w:start w:w="100" w:type="dxa"/>
+              <w:bottom w:w="80" w:type="dxa"/>
+              <w:end w:w="100" w:type="dxa"/>
+            </w:tcMar>
+          </w:tcPr>
+          <w:p>
+            <w:pPr>
+              <w:spacing w:after="0"/>
+            </w:pPr>
+            <w:r>
+              <w:rPr>
+                <w:rFonts w:ascii="Times New Roman" w:hAnsi="Times New Roman"/>
+                <w:sz w:val="17"/>
+              </w:rPr>
+              <w:t>t04_unpaidshipment.sql; ERROR 1644 (45000) at line 4: Order must be paid before shipment</w:t>
+            </w:r>
+          </w:p>
+        </w:tc>
+      </w:tr>
+      <w:tr>
+        <w:tc>
+          <w:tcPr>
+            <w:tcW w:type="dxa" w:w="900"/>
+            <w:vAlign w:val="center"/>
+            <w:tcMar>
+              <w:top w:w="80" w:type="dxa"/>
+              <w:start w:w="100" w:type="dxa"/>
+              <w:bottom w:w="80" w:type="dxa"/>
+              <w:end w:w="100" w:type="dxa"/>
+            </w:tcMar>
+          </w:tcPr>
+          <w:p>
+            <w:pPr>
+              <w:spacing w:after="0"/>
+            </w:pPr>
+            <w:r>
+              <w:rPr>
+                <w:rFonts w:ascii="Times New Roman" w:hAnsi="Times New Roman"/>
+                <w:sz w:val="17"/>
+              </w:rPr>
+              <w:t>PASS</w:t>
+            </w:r>
+          </w:p>
+        </w:tc>
+        <w:tc>
+          <w:tcPr>
+            <w:tcW w:type="dxa" w:w="3400"/>
+            <w:vAlign w:val="center"/>
+            <w:tcMar>
+              <w:top w:w="80" w:type="dxa"/>
+              <w:start w:w="100" w:type="dxa"/>
+              <w:bottom w:w="80" w:type="dxa"/>
+              <w:end w:w="100" w:type="dxa"/>
+            </w:tcMar>
+          </w:tcPr>
+          <w:p>
+            <w:pPr>
+              <w:spacing w:after="0"/>
+            </w:pPr>
+            <w:r>
+              <w:rPr>
+                <w:rFonts w:ascii="Times New Roman" w:hAnsi="Times New Roman"/>
+                <w:sz w:val="17"/>
+              </w:rPr>
+              <w:t>Assessed business rule: Rule 5 one supervisor</w:t>
+            </w:r>
+          </w:p>
+        </w:tc>
+        <w:tc>
+          <w:tcPr>
+            <w:tcW w:type="dxa" w:w="5060"/>
+            <w:vAlign w:val="center"/>
+            <w:tcMar>
+              <w:top w:w="80" w:type="dxa"/>
+              <w:start w:w="100" w:type="dxa"/>
+              <w:bottom w:w="80" w:type="dxa"/>
+              <w:end w:w="100" w:type="dxa"/>
+            </w:tcMar>
+          </w:tcPr>
+          <w:p>
+            <w:pPr>
+              <w:spacing w:after="0"/>
+            </w:pPr>
+            <w:r>
+              <w:rPr>
+                <w:rFonts w:ascii="Times New Roman" w:hAnsi="Times New Roman"/>
+                <w:sz w:val="17"/>
+              </w:rPr>
+              <w:t>t05_overlappingsupervision.sql; ERROR 1644 (45000) at line 3: Employee already has a supervisor during this period</w:t>
+            </w:r>
+          </w:p>
+        </w:tc>
+      </w:tr>
+      <w:tr>
+        <w:tc>
+          <w:tcPr>
+            <w:tcW w:type="dxa" w:w="900"/>
+            <w:vAlign w:val="center"/>
+            <w:tcMar>
+              <w:top w:w="80" w:type="dxa"/>
+              <w:start w:w="100" w:type="dxa"/>
+              <w:bottom w:w="80" w:type="dxa"/>
+              <w:end w:w="100" w:type="dxa"/>
+            </w:tcMar>
+          </w:tcPr>
+          <w:p>
+            <w:pPr>
+              <w:spacing w:after="0"/>
+            </w:pPr>
+            <w:r>
+              <w:rPr>
+                <w:rFonts w:ascii="Times New Roman" w:hAnsi="Times New Roman"/>
+                <w:sz w:val="17"/>
+              </w:rPr>
+              <w:t>PASS</w:t>
+            </w:r>
+          </w:p>
+        </w:tc>
+        <w:tc>
+          <w:tcPr>
+            <w:tcW w:type="dxa" w:w="3400"/>
+            <w:vAlign w:val="center"/>
+            <w:tcMar>
+              <w:top w:w="80" w:type="dxa"/>
+              <w:start w:w="100" w:type="dxa"/>
+              <w:bottom w:w="80" w:type="dxa"/>
+              <w:end w:w="100" w:type="dxa"/>
+            </w:tcMar>
+          </w:tcPr>
+          <w:p>
+            <w:pPr>
+              <w:spacing w:after="0"/>
+            </w:pPr>
+            <w:r>
+              <w:rPr>
+                <w:rFonts w:ascii="Times New Roman" w:hAnsi="Times New Roman"/>
+                <w:sz w:val="17"/>
+              </w:rPr>
+              <w:t>Project Plan requires Actual Completion Date</w:t>
+            </w:r>
+          </w:p>
+        </w:tc>
+        <w:tc>
+          <w:tcPr>
+            <w:tcW w:type="dxa" w:w="5060"/>
+            <w:vAlign w:val="center"/>
+            <w:tcMar>
+              <w:top w:w="80" w:type="dxa"/>
+              <w:start w:w="100" w:type="dxa"/>
+              <w:bottom w:w="80" w:type="dxa"/>
+              <w:end w:w="100" w:type="dxa"/>
+            </w:tcMar>
+          </w:tcPr>
+          <w:p>
+            <w:pPr>
+              <w:spacing w:after="0"/>
+            </w:pPr>
+            <w:r>
+              <w:rPr>
+                <w:rFonts w:ascii="Times New Roman" w:hAnsi="Times New Roman"/>
+                <w:sz w:val="17"/>
+              </w:rPr>
+              <w:t>plan columns</w:t>
+            </w:r>
+          </w:p>
+        </w:tc>
+      </w:tr>
+      <w:tr>
+        <w:tc>
+          <w:tcPr>
+            <w:tcW w:type="dxa" w:w="900"/>
+            <w:vAlign w:val="center"/>
+            <w:tcMar>
+              <w:top w:w="80" w:type="dxa"/>
+              <w:start w:w="100" w:type="dxa"/>
+              <w:bottom w:w="80" w:type="dxa"/>
+              <w:end w:w="100" w:type="dxa"/>
+            </w:tcMar>
+          </w:tcPr>
+          <w:p>
+            <w:pPr>
+              <w:spacing w:after="0"/>
+            </w:pPr>
+            <w:r>
+              <w:rPr>
+                <w:rFonts w:ascii="Times New Roman" w:hAnsi="Times New Roman"/>
+                <w:sz w:val="17"/>
+              </w:rPr>
+              <w:t>PASS</w:t>
+            </w:r>
+          </w:p>
+        </w:tc>
+        <w:tc>
+          <w:tcPr>
+            <w:tcW w:type="dxa" w:w="3400"/>
+            <w:vAlign w:val="center"/>
+            <w:tcMar>
+              <w:top w:w="80" w:type="dxa"/>
+              <w:start w:w="100" w:type="dxa"/>
+              <w:bottom w:w="80" w:type="dxa"/>
+              <w:end w:w="100" w:type="dxa"/>
+            </w:tcMar>
+          </w:tcPr>
+          <w:p>
+            <w:pPr>
+              <w:spacing w:after="0"/>
+            </w:pPr>
+            <w:r>
+              <w:rPr>
+                <w:rFonts w:ascii="Times New Roman" w:hAnsi="Times New Roman"/>
+                <w:sz w:val="17"/>
+              </w:rPr>
+              <w:t>Task 2 has four decisions and page citations</w:t>
+            </w:r>
+          </w:p>
+        </w:tc>
+        <w:tc>
+          <w:tcPr>
+            <w:tcW w:type="dxa" w:w="5060"/>
+            <w:vAlign w:val="center"/>
+            <w:tcMar>
+              <w:top w:w="80" w:type="dxa"/>
+              <w:start w:w="100" w:type="dxa"/>
+              <w:bottom w:w="80" w:type="dxa"/>
+              <w:end w:w="100" w:type="dxa"/>
+            </w:tcMar>
+          </w:tcPr>
+          <w:p>
+            <w:pPr>
+              <w:spacing w:after="0"/>
+            </w:pPr>
+            <w:r>
+              <w:rPr>
+                <w:rFonts w:ascii="Times New Roman" w:hAnsi="Times New Roman"/>
+                <w:sz w:val="17"/>
+              </w:rPr>
+              <w:t>four decisions/citations</w:t>
+            </w:r>
+          </w:p>
+        </w:tc>
+      </w:tr>
+      <w:tr>
+        <w:tc>
+          <w:tcPr>
+            <w:tcW w:type="dxa" w:w="900"/>
+            <w:vAlign w:val="center"/>
+            <w:tcMar>
+              <w:top w:w="80" w:type="dxa"/>
+              <w:start w:w="100" w:type="dxa"/>
+              <w:bottom w:w="80" w:type="dxa"/>
+              <w:end w:w="100" w:type="dxa"/>
+            </w:tcMar>
+          </w:tcPr>
+          <w:p>
+            <w:pPr>
+              <w:spacing w:after="0"/>
+            </w:pPr>
+            <w:r>
+              <w:rPr>
+                <w:rFonts w:ascii="Times New Roman" w:hAnsi="Times New Roman"/>
+                <w:sz w:val="17"/>
+              </w:rPr>
+              <w:t>PASS</w:t>
+            </w:r>
+          </w:p>
+        </w:tc>
+        <w:tc>
+          <w:tcPr>
+            <w:tcW w:type="dxa" w:w="3400"/>
+            <w:vAlign w:val="center"/>
+            <w:tcMar>
+              <w:top w:w="80" w:type="dxa"/>
+              <w:start w:w="100" w:type="dxa"/>
+              <w:bottom w:w="80" w:type="dxa"/>
+              <w:end w:w="100" w:type="dxa"/>
+            </w:tcMar>
+          </w:tcPr>
+          <w:p>
+            <w:pPr>
+              <w:spacing w:after="0"/>
+            </w:pPr>
+            <w:r>
+              <w:rPr>
+                <w:rFonts w:ascii="Times New Roman" w:hAnsi="Times New Roman"/>
+                <w:sz w:val="17"/>
+              </w:rPr>
+              <w:t>Task 2 within 1,200 words</w:t>
+            </w:r>
+          </w:p>
+        </w:tc>
+        <w:tc>
+          <w:tcPr>
+            <w:tcW w:type="dxa" w:w="5060"/>
+            <w:vAlign w:val="center"/>
+            <w:tcMar>
+              <w:top w:w="80" w:type="dxa"/>
+              <w:start w:w="100" w:type="dxa"/>
+              <w:bottom w:w="80" w:type="dxa"/>
+              <w:end w:w="100" w:type="dxa"/>
+            </w:tcMar>
+          </w:tcPr>
+          <w:p>
+            <w:pPr>
+              <w:spacing w:after="0"/>
+            </w:pPr>
+            <w:r>
+              <w:rPr>
+                <w:rFonts w:ascii="Times New Roman" w:hAnsi="Times New Roman"/>
+                <w:sz w:val="17"/>
+              </w:rPr>
+              <w:t>words=696</w:t>
+            </w:r>
+          </w:p>
+        </w:tc>
+      </w:tr>
+      <w:tr>
+        <w:tc>
+          <w:tcPr>
+            <w:tcW w:type="dxa" w:w="900"/>
+            <w:vAlign w:val="center"/>
+            <w:tcMar>
+              <w:top w:w="80" w:type="dxa"/>
+              <w:start w:w="100" w:type="dxa"/>
+              <w:bottom w:w="80" w:type="dxa"/>
+              <w:end w:w="100" w:type="dxa"/>
+            </w:tcMar>
+          </w:tcPr>
+          <w:p>
+            <w:pPr>
+              <w:spacing w:after="0"/>
+            </w:pPr>
+            <w:r>
+              <w:rPr>
+                <w:rFonts w:ascii="Times New Roman" w:hAnsi="Times New Roman"/>
+                <w:sz w:val="17"/>
+              </w:rPr>
+              <w:t>PASS</w:t>
+            </w:r>
+          </w:p>
+        </w:tc>
+        <w:tc>
+          <w:tcPr>
+            <w:tcW w:type="dxa" w:w="3400"/>
+            <w:vAlign w:val="center"/>
+            <w:tcMar>
+              <w:top w:w="80" w:type="dxa"/>
+              <w:start w:w="100" w:type="dxa"/>
+              <w:bottom w:w="80" w:type="dxa"/>
+              <w:end w:w="100" w:type="dxa"/>
+            </w:tcMar>
+          </w:tcPr>
+          <w:p>
+            <w:pPr>
+              <w:spacing w:after="0"/>
+            </w:pPr>
+            <w:r>
+              <w:rPr>
+                <w:rFonts w:ascii="Times New Roman" w:hAnsi="Times New Roman"/>
+                <w:sz w:val="17"/>
+              </w:rPr>
+              <w:t>Task 3 stakeholder table exists</w:t>
+            </w:r>
+          </w:p>
+        </w:tc>
+        <w:tc>
+          <w:tcPr>
+            <w:tcW w:type="dxa" w:w="5060"/>
+            <w:vAlign w:val="center"/>
+            <w:tcMar>
+              <w:top w:w="80" w:type="dxa"/>
+              <w:start w:w="100" w:type="dxa"/>
+              <w:bottom w:w="80" w:type="dxa"/>
+              <w:end w:w="100" w:type="dxa"/>
+            </w:tcMar>
+          </w:tcPr>
+          <w:p>
+            <w:pPr>
+              <w:spacing w:after="0"/>
+            </w:pPr>
+            <w:r>
+              <w:rPr>
+                <w:rFonts w:ascii="Times New Roman" w:hAnsi="Times New Roman"/>
+                <w:sz w:val="17"/>
+              </w:rPr>
+              <w:t>required stakeholder columns/rows</w:t>
+            </w:r>
+          </w:p>
+        </w:tc>
+      </w:tr>
+      <w:tr>
+        <w:tc>
+          <w:tcPr>
+            <w:tcW w:type="dxa" w:w="900"/>
+            <w:vAlign w:val="center"/>
+            <w:tcMar>
+              <w:top w:w="80" w:type="dxa"/>
+              <w:start w:w="100" w:type="dxa"/>
+              <w:bottom w:w="80" w:type="dxa"/>
+              <w:end w:w="100" w:type="dxa"/>
+            </w:tcMar>
+          </w:tcPr>
+          <w:p>
+            <w:pPr>
+              <w:spacing w:after="0"/>
+            </w:pPr>
+            <w:r>
+              <w:rPr>
+                <w:rFonts w:ascii="Times New Roman" w:hAnsi="Times New Roman"/>
+                <w:sz w:val="17"/>
+              </w:rPr>
+              <w:t>PASS</w:t>
+            </w:r>
+          </w:p>
+        </w:tc>
+        <w:tc>
+          <w:tcPr>
+            <w:tcW w:type="dxa" w:w="3400"/>
+            <w:vAlign w:val="center"/>
+            <w:tcMar>
+              <w:top w:w="80" w:type="dxa"/>
+              <w:start w:w="100" w:type="dxa"/>
+              <w:bottom w:w="80" w:type="dxa"/>
+              <w:end w:w="100" w:type="dxa"/>
+            </w:tcMar>
+          </w:tcPr>
+          <w:p>
+            <w:pPr>
+              <w:spacing w:after="0"/>
+            </w:pPr>
+            <w:r>
+              <w:rPr>
+                <w:rFonts w:ascii="Times New Roman" w:hAnsi="Times New Roman"/>
+                <w:sz w:val="17"/>
+              </w:rPr>
+              <w:t>Five assessed Task 3b rules exist</w:t>
+            </w:r>
+          </w:p>
+        </w:tc>
+        <w:tc>
+          <w:tcPr>
+            <w:tcW w:type="dxa" w:w="5060"/>
+            <w:vAlign w:val="center"/>
+            <w:tcMar>
+              <w:top w:w="80" w:type="dxa"/>
+              <w:start w:w="100" w:type="dxa"/>
+              <w:bottom w:w="80" w:type="dxa"/>
+              <w:end w:w="100" w:type="dxa"/>
+            </w:tcMar>
+          </w:tcPr>
+          <w:p>
+            <w:pPr>
+              <w:spacing w:after="0"/>
+            </w:pPr>
+            <w:r>
+              <w:rPr>
+                <w:rFonts w:ascii="Times New Roman" w:hAnsi="Times New Roman"/>
+                <w:sz w:val="17"/>
+              </w:rPr>
+              <w:t>rules=5</w:t>
+            </w:r>
+          </w:p>
+        </w:tc>
+      </w:tr>
+      <w:tr>
+        <w:tc>
+          <w:tcPr>
+            <w:tcW w:type="dxa" w:w="900"/>
+            <w:vAlign w:val="center"/>
+            <w:tcMar>
+              <w:top w:w="80" w:type="dxa"/>
+              <w:start w:w="100" w:type="dxa"/>
+              <w:bottom w:w="80" w:type="dxa"/>
+              <w:end w:w="100" w:type="dxa"/>
+            </w:tcMar>
+          </w:tcPr>
+          <w:p>
+            <w:pPr>
+              <w:spacing w:after="0"/>
+            </w:pPr>
+            <w:r>
+              <w:rPr>
+                <w:rFonts w:ascii="Times New Roman" w:hAnsi="Times New Roman"/>
+                <w:sz w:val="17"/>
+              </w:rPr>
+              <w:t>PASS</w:t>
+            </w:r>
+          </w:p>
+        </w:tc>
+        <w:tc>
+          <w:tcPr>
+            <w:tcW w:type="dxa" w:w="3400"/>
+            <w:vAlign w:val="center"/>
+            <w:tcMar>
+              <w:top w:w="80" w:type="dxa"/>
+              <w:start w:w="100" w:type="dxa"/>
+              <w:bottom w:w="80" w:type="dxa"/>
+              <w:end w:w="100" w:type="dxa"/>
+            </w:tcMar>
+          </w:tcPr>
+          <w:p>
+            <w:pPr>
+              <w:spacing w:after="0"/>
+            </w:pPr>
+            <w:r>
+              <w:rPr>
+                <w:rFonts w:ascii="Times New Roman" w:hAnsi="Times New Roman"/>
+                <w:sz w:val="17"/>
+              </w:rPr>
+              <w:t>Each assessed rule has violation SQL</w:t>
+            </w:r>
+          </w:p>
+        </w:tc>
+        <w:tc>
+          <w:tcPr>
+            <w:tcW w:type="dxa" w:w="5060"/>
+            <w:vAlign w:val="center"/>
+            <w:tcMar>
+              <w:top w:w="80" w:type="dxa"/>
+              <w:start w:w="100" w:type="dxa"/>
+              <w:bottom w:w="80" w:type="dxa"/>
+              <w:end w:w="100" w:type="dxa"/>
+            </w:tcMar>
+          </w:tcPr>
+          <w:p>
+            <w:pPr>
+              <w:spacing w:after="0"/>
+            </w:pPr>
+            <w:r>
+              <w:rPr>
+                <w:rFonts w:ascii="Times New Roman" w:hAnsi="Times New Roman"/>
+                <w:sz w:val="17"/>
+              </w:rPr>
+              <w:t>test files present</w:t>
+            </w:r>
+          </w:p>
+        </w:tc>
+      </w:tr>
+      <w:tr>
+        <w:tc>
+          <w:tcPr>
+            <w:tcW w:type="dxa" w:w="900"/>
+            <w:vAlign w:val="center"/>
+            <w:tcMar>
+              <w:top w:w="80" w:type="dxa"/>
+              <w:start w:w="100" w:type="dxa"/>
+              <w:bottom w:w="80" w:type="dxa"/>
+              <w:end w:w="100" w:type="dxa"/>
+            </w:tcMar>
+          </w:tcPr>
+          <w:p>
+            <w:pPr>
+              <w:spacing w:after="0"/>
+            </w:pPr>
+            <w:r>
+              <w:rPr>
+                <w:rFonts w:ascii="Times New Roman" w:hAnsi="Times New Roman"/>
+                <w:sz w:val="17"/>
+              </w:rPr>
+              <w:t>PASS</w:t>
+            </w:r>
+          </w:p>
+        </w:tc>
+        <w:tc>
+          <w:tcPr>
+            <w:tcW w:type="dxa" w:w="3400"/>
+            <w:vAlign w:val="center"/>
+            <w:tcMar>
+              <w:top w:w="80" w:type="dxa"/>
+              <w:start w:w="100" w:type="dxa"/>
+              <w:bottom w:w="80" w:type="dxa"/>
+              <w:end w:w="100" w:type="dxa"/>
+            </w:tcMar>
+          </w:tcPr>
+          <w:p>
+            <w:pPr>
+              <w:spacing w:after="0"/>
+            </w:pPr>
+            <w:r>
+              <w:rPr>
+                <w:rFonts w:ascii="Times New Roman" w:hAnsi="Times New Roman"/>
+                <w:sz w:val="17"/>
+              </w:rPr>
+              <w:t>Query submission contains CREATE VIEW</w:t>
+            </w:r>
+          </w:p>
+        </w:tc>
+        <w:tc>
+          <w:tcPr>
+            <w:tcW w:type="dxa" w:w="5060"/>
+            <w:vAlign w:val="center"/>
+            <w:tcMar>
+              <w:top w:w="80" w:type="dxa"/>
+              <w:start w:w="100" w:type="dxa"/>
+              <w:bottom w:w="80" w:type="dxa"/>
+              <w:end w:w="100" w:type="dxa"/>
+            </w:tcMar>
+          </w:tcPr>
+          <w:p>
+            <w:pPr>
+              <w:spacing w:after="0"/>
+            </w:pPr>
+            <w:r>
+              <w:rPr>
+                <w:rFonts w:ascii="Times New Roman" w:hAnsi="Times New Roman"/>
+                <w:sz w:val="17"/>
+              </w:rPr>
+              <w:t>CREATE VIEW openincidentaction</w:t>
+            </w:r>
+          </w:p>
+        </w:tc>
+      </w:tr>
+      <w:tr>
+        <w:tc>
+          <w:tcPr>
+            <w:tcW w:type="dxa" w:w="900"/>
+            <w:vAlign w:val="center"/>
+            <w:tcMar>
+              <w:top w:w="80" w:type="dxa"/>
+              <w:start w:w="100" w:type="dxa"/>
+              <w:bottom w:w="80" w:type="dxa"/>
+              <w:end w:w="100" w:type="dxa"/>
+            </w:tcMar>
+          </w:tcPr>
+          <w:p>
+            <w:pPr>
+              <w:spacing w:after="0"/>
+            </w:pPr>
+            <w:r>
+              <w:rPr>
+                <w:rFonts w:ascii="Times New Roman" w:hAnsi="Times New Roman"/>
+                <w:sz w:val="17"/>
+              </w:rPr>
+              <w:t>PASS</w:t>
+            </w:r>
+          </w:p>
+        </w:tc>
+        <w:tc>
+          <w:tcPr>
+            <w:tcW w:type="dxa" w:w="3400"/>
+            <w:vAlign w:val="center"/>
+            <w:tcMar>
+              <w:top w:w="80" w:type="dxa"/>
+              <w:start w:w="100" w:type="dxa"/>
+              <w:bottom w:w="80" w:type="dxa"/>
+              <w:end w:w="100" w:type="dxa"/>
+            </w:tcMar>
+          </w:tcPr>
+          <w:p>
+            <w:pPr>
+              <w:spacing w:after="0"/>
+            </w:pPr>
+            <w:r>
+              <w:rPr>
+                <w:rFonts w:ascii="Times New Roman" w:hAnsi="Times New Roman"/>
+                <w:sz w:val="17"/>
+              </w:rPr>
+              <w:t>Query submission contains CREATE PROCEDURE</w:t>
+            </w:r>
+          </w:p>
+        </w:tc>
+        <w:tc>
+          <w:tcPr>
+            <w:tcW w:type="dxa" w:w="5060"/>
+            <w:vAlign w:val="center"/>
+            <w:tcMar>
+              <w:top w:w="80" w:type="dxa"/>
+              <w:start w:w="100" w:type="dxa"/>
+              <w:bottom w:w="80" w:type="dxa"/>
+              <w:end w:w="100" w:type="dxa"/>
+            </w:tcMar>
+          </w:tcPr>
+          <w:p>
+            <w:pPr>
+              <w:spacing w:after="0"/>
+            </w:pPr>
+            <w:r>
+              <w:rPr>
+                <w:rFonts w:ascii="Times New Roman" w:hAnsi="Times New Roman"/>
+                <w:sz w:val="17"/>
+              </w:rPr>
+              <w:t>CREATE PROCEDURE getExpiringQualifications</w:t>
+            </w:r>
+          </w:p>
+        </w:tc>
+      </w:tr>
+      <w:tr>
+        <w:tc>
+          <w:tcPr>
+            <w:tcW w:type="dxa" w:w="900"/>
+            <w:vAlign w:val="center"/>
+            <w:tcMar>
+              <w:top w:w="80" w:type="dxa"/>
+              <w:start w:w="100" w:type="dxa"/>
+              <w:bottom w:w="80" w:type="dxa"/>
+              <w:end w:w="100" w:type="dxa"/>
+            </w:tcMar>
+          </w:tcPr>
+          <w:p>
+            <w:pPr>
+              <w:spacing w:after="0"/>
+            </w:pPr>
+            <w:r>
+              <w:rPr>
+                <w:rFonts w:ascii="Times New Roman" w:hAnsi="Times New Roman"/>
+                <w:sz w:val="17"/>
+              </w:rPr>
+              <w:t>PASS</w:t>
+            </w:r>
+          </w:p>
+        </w:tc>
+        <w:tc>
+          <w:tcPr>
+            <w:tcW w:type="dxa" w:w="3400"/>
+            <w:vAlign w:val="center"/>
+            <w:tcMar>
+              <w:top w:w="80" w:type="dxa"/>
+              <w:start w:w="100" w:type="dxa"/>
+              <w:bottom w:w="80" w:type="dxa"/>
+              <w:end w:w="100" w:type="dxa"/>
+            </w:tcMar>
+          </w:tcPr>
+          <w:p>
+            <w:pPr>
+              <w:spacing w:after="0"/>
+            </w:pPr>
+            <w:r>
+              <w:rPr>
+                <w:rFonts w:ascii="Times New Roman" w:hAnsi="Times New Roman"/>
+                <w:sz w:val="17"/>
+              </w:rPr>
+              <w:t>Query submission contains 30-day call</w:t>
+            </w:r>
+          </w:p>
+        </w:tc>
+        <w:tc>
+          <w:tcPr>
+            <w:tcW w:type="dxa" w:w="5060"/>
+            <w:vAlign w:val="center"/>
+            <w:tcMar>
+              <w:top w:w="80" w:type="dxa"/>
+              <w:start w:w="100" w:type="dxa"/>
+              <w:bottom w:w="80" w:type="dxa"/>
+              <w:end w:w="100" w:type="dxa"/>
+            </w:tcMar>
+          </w:tcPr>
+          <w:p>
+            <w:pPr>
+              <w:spacing w:after="0"/>
+            </w:pPr>
+            <w:r>
+              <w:rPr>
+                <w:rFonts w:ascii="Times New Roman" w:hAnsi="Times New Roman"/>
+                <w:sz w:val="17"/>
+              </w:rPr>
+              <w:t>CALL getExpiringQualifications(30)</w:t>
+            </w:r>
+          </w:p>
+        </w:tc>
+      </w:tr>
+      <w:tr>
+        <w:tc>
+          <w:tcPr>
+            <w:tcW w:type="dxa" w:w="900"/>
+            <w:vAlign w:val="center"/>
+            <w:tcMar>
+              <w:top w:w="80" w:type="dxa"/>
+              <w:start w:w="100" w:type="dxa"/>
+              <w:bottom w:w="80" w:type="dxa"/>
+              <w:end w:w="100" w:type="dxa"/>
+            </w:tcMar>
+          </w:tcPr>
+          <w:p>
+            <w:pPr>
+              <w:spacing w:after="0"/>
+            </w:pPr>
+            <w:r>
+              <w:rPr>
+                <w:rFonts w:ascii="Times New Roman" w:hAnsi="Times New Roman"/>
+                <w:sz w:val="17"/>
+              </w:rPr>
+              <w:t>PASS</w:t>
+            </w:r>
+          </w:p>
+        </w:tc>
+        <w:tc>
+          <w:tcPr>
+            <w:tcW w:type="dxa" w:w="3400"/>
+            <w:vAlign w:val="center"/>
+            <w:tcMar>
+              <w:top w:w="80" w:type="dxa"/>
+              <w:start w:w="100" w:type="dxa"/>
+              <w:bottom w:w="80" w:type="dxa"/>
+              <w:end w:w="100" w:type="dxa"/>
+            </w:tcMar>
+          </w:tcPr>
+          <w:p>
+            <w:pPr>
+              <w:spacing w:after="0"/>
+            </w:pPr>
+            <w:r>
+              <w:rPr>
+                <w:rFonts w:ascii="Times New Roman" w:hAnsi="Times New Roman"/>
+                <w:sz w:val="17"/>
+              </w:rPr>
+              <w:t>Query submission contains 90-day call</w:t>
+            </w:r>
+          </w:p>
+        </w:tc>
+        <w:tc>
+          <w:tcPr>
+            <w:tcW w:type="dxa" w:w="5060"/>
+            <w:vAlign w:val="center"/>
+            <w:tcMar>
+              <w:top w:w="80" w:type="dxa"/>
+              <w:start w:w="100" w:type="dxa"/>
+              <w:bottom w:w="80" w:type="dxa"/>
+              <w:end w:w="100" w:type="dxa"/>
+            </w:tcMar>
+          </w:tcPr>
+          <w:p>
+            <w:pPr>
+              <w:spacing w:after="0"/>
+            </w:pPr>
+            <w:r>
+              <w:rPr>
+                <w:rFonts w:ascii="Times New Roman" w:hAnsi="Times New Roman"/>
+                <w:sz w:val="17"/>
+              </w:rPr>
+              <w:t>CALL getExpiringQualifications(90)</w:t>
+            </w:r>
+          </w:p>
+        </w:tc>
+      </w:tr>
+      <w:tr>
+        <w:tc>
+          <w:tcPr>
+            <w:tcW w:type="dxa" w:w="900"/>
+            <w:vAlign w:val="center"/>
+            <w:tcMar>
+              <w:top w:w="80" w:type="dxa"/>
+              <w:start w:w="100" w:type="dxa"/>
+              <w:bottom w:w="80" w:type="dxa"/>
+              <w:end w:w="100" w:type="dxa"/>
+            </w:tcMar>
+          </w:tcPr>
+          <w:p>
+            <w:pPr>
+              <w:spacing w:after="0"/>
+            </w:pPr>
+            <w:r>
+              <w:rPr>
+                <w:rFonts w:ascii="Times New Roman" w:hAnsi="Times New Roman"/>
+                <w:sz w:val="17"/>
+              </w:rPr>
+              <w:t>PASS</w:t>
+            </w:r>
+          </w:p>
+        </w:tc>
+        <w:tc>
+          <w:tcPr>
+            <w:tcW w:type="dxa" w:w="3400"/>
+            <w:vAlign w:val="center"/>
+            <w:tcMar>
+              <w:top w:w="80" w:type="dxa"/>
+              <w:start w:w="100" w:type="dxa"/>
+              <w:bottom w:w="80" w:type="dxa"/>
+              <w:end w:w="100" w:type="dxa"/>
+            </w:tcMar>
+          </w:tcPr>
+          <w:p>
+            <w:pPr>
+              <w:spacing w:after="0"/>
+            </w:pPr>
+            <w:r>
+              <w:rPr>
+                <w:rFonts w:ascii="Times New Roman" w:hAnsi="Times New Roman"/>
+                <w:sz w:val="17"/>
+              </w:rPr>
+              <w:t>Query submission contains EXPLAIN</w:t>
+            </w:r>
+          </w:p>
+        </w:tc>
+        <w:tc>
+          <w:tcPr>
+            <w:tcW w:type="dxa" w:w="5060"/>
+            <w:vAlign w:val="center"/>
+            <w:tcMar>
+              <w:top w:w="80" w:type="dxa"/>
+              <w:start w:w="100" w:type="dxa"/>
+              <w:bottom w:w="80" w:type="dxa"/>
+              <w:end w:w="100" w:type="dxa"/>
+            </w:tcMar>
+          </w:tcPr>
+          <w:p>
+            <w:pPr>
+              <w:spacing w:after="0"/>
+            </w:pPr>
+            <w:r>
+              <w:rPr>
+                <w:rFonts w:ascii="Times New Roman" w:hAnsi="Times New Roman"/>
+                <w:sz w:val="17"/>
+              </w:rPr>
+              <w:t>EXPLAIN</w:t>
+            </w:r>
+          </w:p>
+        </w:tc>
+      </w:tr>
+      <w:tr>
+        <w:tc>
+          <w:tcPr>
+            <w:tcW w:type="dxa" w:w="900"/>
+            <w:vAlign w:val="center"/>
+            <w:tcMar>
+              <w:top w:w="80" w:type="dxa"/>
+              <w:start w:w="100" w:type="dxa"/>
+              <w:bottom w:w="80" w:type="dxa"/>
+              <w:end w:w="100" w:type="dxa"/>
+            </w:tcMar>
+          </w:tcPr>
+          <w:p>
+            <w:pPr>
+              <w:spacing w:after="0"/>
+            </w:pPr>
+            <w:r>
+              <w:rPr>
+                <w:rFonts w:ascii="Times New Roman" w:hAnsi="Times New Roman"/>
+                <w:sz w:val="17"/>
+              </w:rPr>
+              <w:t>PASS</w:t>
+            </w:r>
+          </w:p>
+        </w:tc>
+        <w:tc>
+          <w:tcPr>
+            <w:tcW w:type="dxa" w:w="3400"/>
+            <w:vAlign w:val="center"/>
+            <w:tcMar>
+              <w:top w:w="80" w:type="dxa"/>
+              <w:start w:w="100" w:type="dxa"/>
+              <w:bottom w:w="80" w:type="dxa"/>
+              <w:end w:w="100" w:type="dxa"/>
+            </w:tcMar>
+          </w:tcPr>
+          <w:p>
+            <w:pPr>
+              <w:spacing w:after="0"/>
+            </w:pPr>
+            <w:r>
+              <w:rPr>
+                <w:rFonts w:ascii="Times New Roman" w:hAnsi="Times New Roman"/>
+                <w:sz w:val="17"/>
+              </w:rPr>
+              <w:t>Query submission contains six queries</w:t>
+            </w:r>
+          </w:p>
+        </w:tc>
+        <w:tc>
+          <w:tcPr>
+            <w:tcW w:type="dxa" w:w="5060"/>
+            <w:vAlign w:val="center"/>
+            <w:tcMar>
+              <w:top w:w="80" w:type="dxa"/>
+              <w:start w:w="100" w:type="dxa"/>
+              <w:bottom w:w="80" w:type="dxa"/>
+              <w:end w:w="100" w:type="dxa"/>
+            </w:tcMar>
+          </w:tcPr>
+          <w:p>
+            <w:pPr>
+              <w:spacing w:after="0"/>
+            </w:pPr>
+            <w:r>
+              <w:rPr>
+                <w:rFonts w:ascii="Times New Roman" w:hAnsi="Times New Roman"/>
+                <w:sz w:val="17"/>
+              </w:rPr>
+              <w:t>six query markers</w:t>
+            </w:r>
+          </w:p>
+        </w:tc>
+      </w:tr>
+      <w:tr>
+        <w:tc>
+          <w:tcPr>
+            <w:tcW w:type="dxa" w:w="900"/>
+            <w:vAlign w:val="center"/>
+            <w:tcMar>
+              <w:top w:w="80" w:type="dxa"/>
+              <w:start w:w="100" w:type="dxa"/>
+              <w:bottom w:w="80" w:type="dxa"/>
+              <w:end w:w="100" w:type="dxa"/>
+            </w:tcMar>
+          </w:tcPr>
+          <w:p>
+            <w:pPr>
+              <w:spacing w:after="0"/>
+            </w:pPr>
+            <w:r>
+              <w:rPr>
+                <w:rFonts w:ascii="Times New Roman" w:hAnsi="Times New Roman"/>
+                <w:sz w:val="17"/>
+              </w:rPr>
+              <w:t>PASS</w:t>
+            </w:r>
+          </w:p>
+        </w:tc>
+        <w:tc>
+          <w:tcPr>
+            <w:tcW w:type="dxa" w:w="3400"/>
+            <w:vAlign w:val="center"/>
+            <w:tcMar>
+              <w:top w:w="80" w:type="dxa"/>
+              <w:start w:w="100" w:type="dxa"/>
+              <w:bottom w:w="80" w:type="dxa"/>
+              <w:end w:w="100" w:type="dxa"/>
+            </w:tcMar>
+          </w:tcPr>
+          <w:p>
+            <w:pPr>
+              <w:spacing w:after="0"/>
+            </w:pPr>
+            <w:r>
+              <w:rPr>
+                <w:rFonts w:ascii="Times New Roman" w:hAnsi="Times New Roman"/>
+                <w:sz w:val="17"/>
+              </w:rPr>
+              <w:t>Database export contains six queries</w:t>
+            </w:r>
+          </w:p>
+        </w:tc>
+        <w:tc>
+          <w:tcPr>
+            <w:tcW w:type="dxa" w:w="5060"/>
+            <w:vAlign w:val="center"/>
+            <w:tcMar>
+              <w:top w:w="80" w:type="dxa"/>
+              <w:start w:w="100" w:type="dxa"/>
+              <w:bottom w:w="80" w:type="dxa"/>
+              <w:end w:w="100" w:type="dxa"/>
+            </w:tcMar>
+          </w:tcPr>
+          <w:p>
+            <w:pPr>
+              <w:spacing w:after="0"/>
+            </w:pPr>
+            <w:r>
+              <w:rPr>
+                <w:rFonts w:ascii="Times New Roman" w:hAnsi="Times New Roman"/>
+                <w:sz w:val="17"/>
+              </w:rPr>
+              <w:t>embedded query section</w:t>
+            </w:r>
+          </w:p>
+        </w:tc>
+      </w:tr>
+      <w:tr>
+        <w:tc>
+          <w:tcPr>
+            <w:tcW w:type="dxa" w:w="900"/>
+            <w:vAlign w:val="center"/>
+            <w:tcMar>
+              <w:top w:w="80" w:type="dxa"/>
+              <w:start w:w="100" w:type="dxa"/>
+              <w:bottom w:w="80" w:type="dxa"/>
+              <w:end w:w="100" w:type="dxa"/>
+            </w:tcMar>
+          </w:tcPr>
+          <w:p>
+            <w:pPr>
+              <w:spacing w:after="0"/>
+            </w:pPr>
+            <w:r>
+              <w:rPr>
+                <w:rFonts w:ascii="Times New Roman" w:hAnsi="Times New Roman"/>
+                <w:sz w:val="17"/>
+              </w:rPr>
+              <w:t>PASS</w:t>
+            </w:r>
+          </w:p>
+        </w:tc>
+        <w:tc>
+          <w:tcPr>
+            <w:tcW w:type="dxa" w:w="3400"/>
+            <w:vAlign w:val="center"/>
+            <w:tcMar>
+              <w:top w:w="80" w:type="dxa"/>
+              <w:start w:w="100" w:type="dxa"/>
+              <w:bottom w:w="80" w:type="dxa"/>
+              <w:end w:w="100" w:type="dxa"/>
+            </w:tcMar>
+          </w:tcPr>
+          <w:p>
+            <w:pPr>
+              <w:spacing w:after="0"/>
+            </w:pPr>
+            <w:r>
+              <w:rPr>
+                <w:rFonts w:ascii="Times New Roman" w:hAnsi="Times New Roman"/>
+                <w:sz w:val="17"/>
+              </w:rPr>
+              <w:t>Query 3 filters AFFECTED involvement</w:t>
+            </w:r>
+          </w:p>
+        </w:tc>
+        <w:tc>
+          <w:tcPr>
+            <w:tcW w:type="dxa" w:w="5060"/>
+            <w:vAlign w:val="center"/>
+            <w:tcMar>
+              <w:top w:w="80" w:type="dxa"/>
+              <w:start w:w="100" w:type="dxa"/>
+              <w:bottom w:w="80" w:type="dxa"/>
+              <w:end w:w="100" w:type="dxa"/>
+            </w:tcMar>
+          </w:tcPr>
+          <w:p>
+            <w:pPr>
+              <w:spacing w:after="0"/>
+            </w:pPr>
+            <w:r>
+              <w:rPr>
+                <w:rFonts w:ascii="Times New Roman" w:hAnsi="Times New Roman"/>
+                <w:sz w:val="17"/>
+              </w:rPr>
+              <w:t>filter present</w:t>
+            </w:r>
+          </w:p>
+        </w:tc>
+      </w:tr>
+      <w:tr>
+        <w:tc>
+          <w:tcPr>
+            <w:tcW w:type="dxa" w:w="900"/>
+            <w:vAlign w:val="center"/>
+            <w:tcMar>
+              <w:top w:w="80" w:type="dxa"/>
+              <w:start w:w="100" w:type="dxa"/>
+              <w:bottom w:w="80" w:type="dxa"/>
+              <w:end w:w="100" w:type="dxa"/>
+            </w:tcMar>
+          </w:tcPr>
+          <w:p>
+            <w:pPr>
+              <w:spacing w:after="0"/>
+            </w:pPr>
+            <w:r>
+              <w:rPr>
+                <w:rFonts w:ascii="Times New Roman" w:hAnsi="Times New Roman"/>
+                <w:sz w:val="17"/>
+              </w:rPr>
+              <w:t>PASS</w:t>
+            </w:r>
+          </w:p>
+        </w:tc>
+        <w:tc>
+          <w:tcPr>
+            <w:tcW w:type="dxa" w:w="3400"/>
+            <w:vAlign w:val="center"/>
+            <w:tcMar>
+              <w:top w:w="80" w:type="dxa"/>
+              <w:start w:w="100" w:type="dxa"/>
+              <w:bottom w:w="80" w:type="dxa"/>
+              <w:end w:w="100" w:type="dxa"/>
+            </w:tcMar>
+          </w:tcPr>
+          <w:p>
+            <w:pPr>
+              <w:spacing w:after="0"/>
+            </w:pPr>
+            <w:r>
+              <w:rPr>
+                <w:rFonts w:ascii="Times New Roman" w:hAnsi="Times New Roman"/>
+                <w:sz w:val="17"/>
+              </w:rPr>
+              <w:t>Data Dictionary has explicit domains</w:t>
+            </w:r>
+          </w:p>
+        </w:tc>
+        <w:tc>
+          <w:tcPr>
+            <w:tcW w:type="dxa" w:w="5060"/>
+            <w:vAlign w:val="center"/>
+            <w:tcMar>
+              <w:top w:w="80" w:type="dxa"/>
+              <w:start w:w="100" w:type="dxa"/>
+              <w:bottom w:w="80" w:type="dxa"/>
+              <w:end w:w="100" w:type="dxa"/>
+            </w:tcMar>
+          </w:tcPr>
+          <w:p>
+            <w:pPr>
+              <w:spacing w:after="0"/>
+            </w:pPr>
+            <w:r>
+              <w:rPr>
+                <w:rFonts w:ascii="Times New Roman" w:hAnsi="Times New Roman"/>
+                <w:sz w:val="17"/>
+              </w:rPr>
+              <w:t>generic domain absent</w:t>
+            </w:r>
+          </w:p>
+        </w:tc>
+      </w:tr>
+      <w:tr>
+        <w:tc>
+          <w:tcPr>
+            <w:tcW w:type="dxa" w:w="900"/>
+            <w:vAlign w:val="center"/>
+            <w:tcMar>
+              <w:top w:w="80" w:type="dxa"/>
+              <w:start w:w="100" w:type="dxa"/>
+              <w:bottom w:w="80" w:type="dxa"/>
+              <w:end w:w="100" w:type="dxa"/>
+            </w:tcMar>
+          </w:tcPr>
+          <w:p>
+            <w:pPr>
+              <w:spacing w:after="0"/>
+            </w:pPr>
+            <w:r>
+              <w:rPr>
+                <w:rFonts w:ascii="Times New Roman" w:hAnsi="Times New Roman"/>
+                <w:sz w:val="17"/>
+              </w:rPr>
+              <w:t>PASS</w:t>
+            </w:r>
+          </w:p>
+        </w:tc>
+        <w:tc>
+          <w:tcPr>
+            <w:tcW w:type="dxa" w:w="3400"/>
+            <w:vAlign w:val="center"/>
+            <w:tcMar>
+              <w:top w:w="80" w:type="dxa"/>
+              <w:start w:w="100" w:type="dxa"/>
+              <w:bottom w:w="80" w:type="dxa"/>
+              <w:end w:w="100" w:type="dxa"/>
+            </w:tcMar>
+          </w:tcPr>
+          <w:p>
+            <w:pPr>
+              <w:spacing w:after="0"/>
+            </w:pPr>
+            <w:r>
+              <w:rPr>
+                <w:rFonts w:ascii="Times New Roman" w:hAnsi="Times New Roman"/>
+                <w:sz w:val="17"/>
+              </w:rPr>
+              <w:t>Data Dictionary has semantic descriptions</w:t>
+            </w:r>
+          </w:p>
+        </w:tc>
+        <w:tc>
+          <w:tcPr>
+            <w:tcW w:type="dxa" w:w="5060"/>
+            <w:vAlign w:val="center"/>
+            <w:tcMar>
+              <w:top w:w="80" w:type="dxa"/>
+              <w:start w:w="100" w:type="dxa"/>
+              <w:bottom w:w="80" w:type="dxa"/>
+              <w:end w:w="100" w:type="dxa"/>
+            </w:tcMar>
+          </w:tcPr>
+          <w:p>
+            <w:pPr>
+              <w:spacing w:after="0"/>
+            </w:pPr>
+            <w:r>
+              <w:rPr>
+                <w:rFonts w:ascii="Times New Roman" w:hAnsi="Times New Roman"/>
+                <w:sz w:val="17"/>
+              </w:rPr>
+              <w:t>generic description absent</w:t>
+            </w:r>
+          </w:p>
+        </w:tc>
+      </w:tr>
+      <w:tr>
+        <w:tc>
+          <w:tcPr>
+            <w:tcW w:type="dxa" w:w="900"/>
+            <w:vAlign w:val="center"/>
+            <w:tcMar>
+              <w:top w:w="80" w:type="dxa"/>
+              <w:start w:w="100" w:type="dxa"/>
+              <w:bottom w:w="80" w:type="dxa"/>
+              <w:end w:w="100" w:type="dxa"/>
+            </w:tcMar>
+          </w:tcPr>
+          <w:p>
+            <w:pPr>
+              <w:spacing w:after="0"/>
+            </w:pPr>
+            <w:r>
+              <w:rPr>
+                <w:rFonts w:ascii="Times New Roman" w:hAnsi="Times New Roman"/>
+                <w:sz w:val="17"/>
+              </w:rPr>
+              <w:t>PASS</w:t>
+            </w:r>
+          </w:p>
+        </w:tc>
+        <w:tc>
+          <w:tcPr>
+            <w:tcW w:type="dxa" w:w="3400"/>
+            <w:vAlign w:val="center"/>
+            <w:tcMar>
+              <w:top w:w="80" w:type="dxa"/>
+              <w:start w:w="100" w:type="dxa"/>
+              <w:bottom w:w="80" w:type="dxa"/>
+              <w:end w:w="100" w:type="dxa"/>
+            </w:tcMar>
+          </w:tcPr>
+          <w:p>
+            <w:pPr>
+              <w:spacing w:after="0"/>
+            </w:pPr>
+            <w:r>
+              <w:rPr>
+                <w:rFonts w:ascii="Times New Roman" w:hAnsi="Times New Roman"/>
+                <w:sz w:val="17"/>
+              </w:rPr>
+              <w:t>Full ER image meets resolution requirement</w:t>
+            </w:r>
+          </w:p>
+        </w:tc>
+        <w:tc>
+          <w:tcPr>
+            <w:tcW w:type="dxa" w:w="5060"/>
+            <w:vAlign w:val="center"/>
+            <w:tcMar>
+              <w:top w:w="80" w:type="dxa"/>
+              <w:start w:w="100" w:type="dxa"/>
+              <w:bottom w:w="80" w:type="dxa"/>
+              <w:end w:w="100" w:type="dxa"/>
+            </w:tcMar>
+          </w:tcPr>
+          <w:p>
+            <w:pPr>
+              <w:spacing w:after="0"/>
+            </w:pPr>
+            <w:r>
+              <w:rPr>
+                <w:rFonts w:ascii="Times New Roman" w:hAnsi="Times New Roman"/>
+                <w:sz w:val="17"/>
+              </w:rPr>
+              <w:t>resolution=(1586, 2551)</w:t>
+            </w:r>
+          </w:p>
+        </w:tc>
+      </w:tr>
+      <w:tr>
+        <w:tc>
+          <w:tcPr>
+            <w:tcW w:type="dxa" w:w="900"/>
+            <w:vAlign w:val="center"/>
+            <w:tcMar>
+              <w:top w:w="80" w:type="dxa"/>
+              <w:start w:w="100" w:type="dxa"/>
+              <w:bottom w:w="80" w:type="dxa"/>
+              <w:end w:w="100" w:type="dxa"/>
+            </w:tcMar>
+          </w:tcPr>
+          <w:p>
+            <w:pPr>
+              <w:spacing w:after="0"/>
+            </w:pPr>
+            <w:r>
+              <w:rPr>
+                <w:rFonts w:ascii="Times New Roman" w:hAnsi="Times New Roman"/>
+                <w:sz w:val="17"/>
+              </w:rPr>
+              <w:t>PASS</w:t>
+            </w:r>
+          </w:p>
+        </w:tc>
+        <w:tc>
+          <w:tcPr>
+            <w:tcW w:type="dxa" w:w="3400"/>
+            <w:vAlign w:val="center"/>
+            <w:tcMar>
+              <w:top w:w="80" w:type="dxa"/>
+              <w:start w:w="100" w:type="dxa"/>
+              <w:bottom w:w="80" w:type="dxa"/>
+              <w:end w:w="100" w:type="dxa"/>
+            </w:tcMar>
+          </w:tcPr>
+          <w:p>
+            <w:pPr>
+              <w:spacing w:after="0"/>
+            </w:pPr>
+            <w:r>
+              <w:rPr>
+                <w:rFonts w:ascii="Times New Roman" w:hAnsi="Times New Roman"/>
+                <w:sz w:val="17"/>
+              </w:rPr>
+              <w:t>Final report contains Task 1</w:t>
+            </w:r>
+          </w:p>
+        </w:tc>
+        <w:tc>
+          <w:tcPr>
+            <w:tcW w:type="dxa" w:w="5060"/>
+            <w:vAlign w:val="center"/>
+            <w:tcMar>
+              <w:top w:w="80" w:type="dxa"/>
+              <w:start w:w="100" w:type="dxa"/>
+              <w:bottom w:w="80" w:type="dxa"/>
+              <w:end w:w="100" w:type="dxa"/>
+            </w:tcMar>
+          </w:tcPr>
+          <w:p>
+            <w:pPr>
+              <w:spacing w:after="0"/>
+            </w:pPr>
+            <w:r>
+              <w:rPr>
+                <w:rFonts w:ascii="Times New Roman" w:hAnsi="Times New Roman"/>
+                <w:sz w:val="17"/>
+              </w:rPr>
+              <w:t>Task 1</w:t>
+            </w:r>
+          </w:p>
+        </w:tc>
+      </w:tr>
+      <w:tr>
+        <w:tc>
+          <w:tcPr>
+            <w:tcW w:type="dxa" w:w="900"/>
+            <w:vAlign w:val="center"/>
+            <w:tcMar>
+              <w:top w:w="80" w:type="dxa"/>
+              <w:start w:w="100" w:type="dxa"/>
+              <w:bottom w:w="80" w:type="dxa"/>
+              <w:end w:w="100" w:type="dxa"/>
+            </w:tcMar>
+          </w:tcPr>
+          <w:p>
+            <w:pPr>
+              <w:spacing w:after="0"/>
+            </w:pPr>
+            <w:r>
+              <w:rPr>
+                <w:rFonts w:ascii="Times New Roman" w:hAnsi="Times New Roman"/>
+                <w:sz w:val="17"/>
+              </w:rPr>
+              <w:t>PASS</w:t>
+            </w:r>
+          </w:p>
+        </w:tc>
+        <w:tc>
+          <w:tcPr>
+            <w:tcW w:type="dxa" w:w="3400"/>
+            <w:vAlign w:val="center"/>
+            <w:tcMar>
+              <w:top w:w="80" w:type="dxa"/>
+              <w:start w:w="100" w:type="dxa"/>
+              <w:bottom w:w="80" w:type="dxa"/>
+              <w:end w:w="100" w:type="dxa"/>
+            </w:tcMar>
+          </w:tcPr>
+          <w:p>
+            <w:pPr>
+              <w:spacing w:after="0"/>
+            </w:pPr>
+            <w:r>
+              <w:rPr>
+                <w:rFonts w:ascii="Times New Roman" w:hAnsi="Times New Roman"/>
+                <w:sz w:val="17"/>
+              </w:rPr>
+              <w:t>Final report contains Task 2</w:t>
+            </w:r>
+          </w:p>
+        </w:tc>
+        <w:tc>
+          <w:tcPr>
+            <w:tcW w:type="dxa" w:w="5060"/>
+            <w:vAlign w:val="center"/>
+            <w:tcMar>
+              <w:top w:w="80" w:type="dxa"/>
+              <w:start w:w="100" w:type="dxa"/>
+              <w:bottom w:w="80" w:type="dxa"/>
+              <w:end w:w="100" w:type="dxa"/>
+            </w:tcMar>
+          </w:tcPr>
+          <w:p>
+            <w:pPr>
+              <w:spacing w:after="0"/>
+            </w:pPr>
+            <w:r>
+              <w:rPr>
+                <w:rFonts w:ascii="Times New Roman" w:hAnsi="Times New Roman"/>
+                <w:sz w:val="17"/>
+              </w:rPr>
+              <w:t>Task 2</w:t>
+            </w:r>
+          </w:p>
+        </w:tc>
+      </w:tr>
+      <w:tr>
+        <w:tc>
+          <w:tcPr>
+            <w:tcW w:type="dxa" w:w="900"/>
+            <w:vAlign w:val="center"/>
+            <w:tcMar>
+              <w:top w:w="80" w:type="dxa"/>
+              <w:start w:w="100" w:type="dxa"/>
+              <w:bottom w:w="80" w:type="dxa"/>
+              <w:end w:w="100" w:type="dxa"/>
+            </w:tcMar>
+          </w:tcPr>
+          <w:p>
+            <w:pPr>
+              <w:spacing w:after="0"/>
+            </w:pPr>
+            <w:r>
+              <w:rPr>
+                <w:rFonts w:ascii="Times New Roman" w:hAnsi="Times New Roman"/>
+                <w:sz w:val="17"/>
+              </w:rPr>
+              <w:t>PASS</w:t>
+            </w:r>
+          </w:p>
+        </w:tc>
+        <w:tc>
+          <w:tcPr>
+            <w:tcW w:type="dxa" w:w="3400"/>
+            <w:vAlign w:val="center"/>
+            <w:tcMar>
+              <w:top w:w="80" w:type="dxa"/>
+              <w:start w:w="100" w:type="dxa"/>
+              <w:bottom w:w="80" w:type="dxa"/>
+              <w:end w:w="100" w:type="dxa"/>
+            </w:tcMar>
+          </w:tcPr>
+          <w:p>
+            <w:pPr>
+              <w:spacing w:after="0"/>
+            </w:pPr>
+            <w:r>
+              <w:rPr>
+                <w:rFonts w:ascii="Times New Roman" w:hAnsi="Times New Roman"/>
+                <w:sz w:val="17"/>
+              </w:rPr>
+              <w:t>Final report contains Task 3</w:t>
+            </w:r>
+          </w:p>
+        </w:tc>
+        <w:tc>
+          <w:tcPr>
+            <w:tcW w:type="dxa" w:w="5060"/>
+            <w:vAlign w:val="center"/>
+            <w:tcMar>
+              <w:top w:w="80" w:type="dxa"/>
+              <w:start w:w="100" w:type="dxa"/>
+              <w:bottom w:w="80" w:type="dxa"/>
+              <w:end w:w="100" w:type="dxa"/>
+            </w:tcMar>
+          </w:tcPr>
+          <w:p>
+            <w:pPr>
+              <w:spacing w:after="0"/>
+            </w:pPr>
+            <w:r>
+              <w:rPr>
+                <w:rFonts w:ascii="Times New Roman" w:hAnsi="Times New Roman"/>
+                <w:sz w:val="17"/>
+              </w:rPr>
+              <w:t>Task 3</w:t>
+            </w:r>
+          </w:p>
+        </w:tc>
+      </w:tr>
+      <w:tr>
+        <w:tc>
+          <w:tcPr>
+            <w:tcW w:type="dxa" w:w="900"/>
+            <w:vAlign w:val="center"/>
+            <w:tcMar>
+              <w:top w:w="80" w:type="dxa"/>
+              <w:start w:w="100" w:type="dxa"/>
+              <w:bottom w:w="80" w:type="dxa"/>
+              <w:end w:w="100" w:type="dxa"/>
+            </w:tcMar>
+          </w:tcPr>
+          <w:p>
+            <w:pPr>
+              <w:spacing w:after="0"/>
+            </w:pPr>
+            <w:r>
+              <w:rPr>
+                <w:rFonts w:ascii="Times New Roman" w:hAnsi="Times New Roman"/>
+                <w:sz w:val="17"/>
+              </w:rPr>
+              <w:t>PASS</w:t>
+            </w:r>
+          </w:p>
+        </w:tc>
+        <w:tc>
+          <w:tcPr>
+            <w:tcW w:type="dxa" w:w="3400"/>
+            <w:vAlign w:val="center"/>
+            <w:tcMar>
+              <w:top w:w="80" w:type="dxa"/>
+              <w:start w:w="100" w:type="dxa"/>
+              <w:bottom w:w="80" w:type="dxa"/>
+              <w:end w:w="100" w:type="dxa"/>
+            </w:tcMar>
+          </w:tcPr>
+          <w:p>
+            <w:pPr>
+              <w:spacing w:after="0"/>
+            </w:pPr>
+            <w:r>
+              <w:rPr>
+                <w:rFonts w:ascii="Times New Roman" w:hAnsi="Times New Roman"/>
+                <w:sz w:val="17"/>
+              </w:rPr>
+              <w:t>Final report contains Task 4</w:t>
+            </w:r>
+          </w:p>
+        </w:tc>
+        <w:tc>
+          <w:tcPr>
+            <w:tcW w:type="dxa" w:w="5060"/>
+            <w:vAlign w:val="center"/>
+            <w:tcMar>
+              <w:top w:w="80" w:type="dxa"/>
+              <w:start w:w="100" w:type="dxa"/>
+              <w:bottom w:w="80" w:type="dxa"/>
+              <w:end w:w="100" w:type="dxa"/>
+            </w:tcMar>
+          </w:tcPr>
+          <w:p>
+            <w:pPr>
+              <w:spacing w:after="0"/>
+            </w:pPr>
+            <w:r>
+              <w:rPr>
+                <w:rFonts w:ascii="Times New Roman" w:hAnsi="Times New Roman"/>
+                <w:sz w:val="17"/>
+              </w:rPr>
+              <w:t>Task 4</w:t>
+            </w:r>
+          </w:p>
+        </w:tc>
+      </w:tr>
+      <w:tr>
+        <w:tc>
+          <w:tcPr>
+            <w:tcW w:type="dxa" w:w="900"/>
+            <w:vAlign w:val="center"/>
+            <w:tcMar>
+              <w:top w:w="80" w:type="dxa"/>
+              <w:start w:w="100" w:type="dxa"/>
+              <w:bottom w:w="80" w:type="dxa"/>
+              <w:end w:w="100" w:type="dxa"/>
+            </w:tcMar>
+          </w:tcPr>
+          <w:p>
+            <w:pPr>
+              <w:spacing w:after="0"/>
+            </w:pPr>
+            <w:r>
+              <w:rPr>
+                <w:rFonts w:ascii="Times New Roman" w:hAnsi="Times New Roman"/>
+                <w:sz w:val="17"/>
+              </w:rPr>
+              <w:t>PASS</w:t>
+            </w:r>
+          </w:p>
+        </w:tc>
+        <w:tc>
+          <w:tcPr>
+            <w:tcW w:type="dxa" w:w="3400"/>
+            <w:vAlign w:val="center"/>
+            <w:tcMar>
+              <w:top w:w="80" w:type="dxa"/>
+              <w:start w:w="100" w:type="dxa"/>
+              <w:bottom w:w="80" w:type="dxa"/>
+              <w:end w:w="100" w:type="dxa"/>
+            </w:tcMar>
+          </w:tcPr>
+          <w:p>
+            <w:pPr>
+              <w:spacing w:after="0"/>
+            </w:pPr>
+            <w:r>
+              <w:rPr>
+                <w:rFonts w:ascii="Times New Roman" w:hAnsi="Times New Roman"/>
+                <w:sz w:val="17"/>
+              </w:rPr>
+              <w:t>Final report contains Task 5</w:t>
+            </w:r>
+          </w:p>
+        </w:tc>
+        <w:tc>
+          <w:tcPr>
+            <w:tcW w:type="dxa" w:w="5060"/>
+            <w:vAlign w:val="center"/>
+            <w:tcMar>
+              <w:top w:w="80" w:type="dxa"/>
+              <w:start w:w="100" w:type="dxa"/>
+              <w:bottom w:w="80" w:type="dxa"/>
+              <w:end w:w="100" w:type="dxa"/>
+            </w:tcMar>
+          </w:tcPr>
+          <w:p>
+            <w:pPr>
+              <w:spacing w:after="0"/>
+            </w:pPr>
+            <w:r>
+              <w:rPr>
+                <w:rFonts w:ascii="Times New Roman" w:hAnsi="Times New Roman"/>
+                <w:sz w:val="17"/>
+              </w:rPr>
+              <w:t>Task 5</w:t>
+            </w:r>
+          </w:p>
+        </w:tc>
+      </w:tr>
+      <w:tr>
+        <w:tc>
+          <w:tcPr>
+            <w:tcW w:type="dxa" w:w="900"/>
+            <w:vAlign w:val="center"/>
+            <w:tcMar>
+              <w:top w:w="80" w:type="dxa"/>
+              <w:start w:w="100" w:type="dxa"/>
+              <w:bottom w:w="80" w:type="dxa"/>
+              <w:end w:w="100" w:type="dxa"/>
+            </w:tcMar>
+          </w:tcPr>
+          <w:p>
+            <w:pPr>
+              <w:spacing w:after="0"/>
+            </w:pPr>
+            <w:r>
+              <w:rPr>
+                <w:rFonts w:ascii="Times New Roman" w:hAnsi="Times New Roman"/>
+                <w:sz w:val="17"/>
+              </w:rPr>
+              <w:t>PASS</w:t>
+            </w:r>
+          </w:p>
+        </w:tc>
+        <w:tc>
+          <w:tcPr>
+            <w:tcW w:type="dxa" w:w="3400"/>
+            <w:vAlign w:val="center"/>
+            <w:tcMar>
+              <w:top w:w="80" w:type="dxa"/>
+              <w:start w:w="100" w:type="dxa"/>
+              <w:bottom w:w="80" w:type="dxa"/>
+              <w:end w:w="100" w:type="dxa"/>
+            </w:tcMar>
+          </w:tcPr>
+          <w:p>
+            <w:pPr>
+              <w:spacing w:after="0"/>
+            </w:pPr>
+            <w:r>
+              <w:rPr>
+                <w:rFonts w:ascii="Times New Roman" w:hAnsi="Times New Roman"/>
+                <w:sz w:val="17"/>
+              </w:rPr>
+              <w:t>Final report contains Task 6</w:t>
+            </w:r>
+          </w:p>
+        </w:tc>
+        <w:tc>
+          <w:tcPr>
+            <w:tcW w:type="dxa" w:w="5060"/>
+            <w:vAlign w:val="center"/>
+            <w:tcMar>
+              <w:top w:w="80" w:type="dxa"/>
+              <w:start w:w="100" w:type="dxa"/>
+              <w:bottom w:w="80" w:type="dxa"/>
+              <w:end w:w="100" w:type="dxa"/>
+            </w:tcMar>
+          </w:tcPr>
+          <w:p>
+            <w:pPr>
+              <w:spacing w:after="0"/>
+            </w:pPr>
+            <w:r>
+              <w:rPr>
+                <w:rFonts w:ascii="Times New Roman" w:hAnsi="Times New Roman"/>
+                <w:sz w:val="17"/>
+              </w:rPr>
+              <w:t>Task 6</w:t>
+            </w:r>
+          </w:p>
+        </w:tc>
+      </w:tr>
+      <w:tr>
+        <w:tc>
+          <w:tcPr>
+            <w:tcW w:type="dxa" w:w="900"/>
+            <w:vAlign w:val="center"/>
+            <w:tcMar>
+              <w:top w:w="80" w:type="dxa"/>
+              <w:start w:w="100" w:type="dxa"/>
+              <w:bottom w:w="80" w:type="dxa"/>
+              <w:end w:w="100" w:type="dxa"/>
+            </w:tcMar>
+          </w:tcPr>
+          <w:p>
+            <w:pPr>
+              <w:spacing w:after="0"/>
+            </w:pPr>
+            <w:r>
+              <w:rPr>
+                <w:rFonts w:ascii="Times New Roman" w:hAnsi="Times New Roman"/>
+                <w:sz w:val="17"/>
+              </w:rPr>
+              <w:t>PASS</w:t>
+            </w:r>
+          </w:p>
+        </w:tc>
+        <w:tc>
+          <w:tcPr>
+            <w:tcW w:type="dxa" w:w="3400"/>
+            <w:vAlign w:val="center"/>
+            <w:tcMar>
+              <w:top w:w="80" w:type="dxa"/>
+              <w:start w:w="100" w:type="dxa"/>
+              <w:bottom w:w="80" w:type="dxa"/>
+              <w:end w:w="100" w:type="dxa"/>
+            </w:tcMar>
+          </w:tcPr>
+          <w:p>
+            <w:pPr>
+              <w:spacing w:after="0"/>
+            </w:pPr>
+            <w:r>
+              <w:rPr>
+                <w:rFonts w:ascii="Times New Roman" w:hAnsi="Times New Roman"/>
+                <w:sz w:val="17"/>
+              </w:rPr>
+              <w:t>Final report contains Task 7</w:t>
+            </w:r>
+          </w:p>
+        </w:tc>
+        <w:tc>
+          <w:tcPr>
+            <w:tcW w:type="dxa" w:w="5060"/>
+            <w:vAlign w:val="center"/>
+            <w:tcMar>
+              <w:top w:w="80" w:type="dxa"/>
+              <w:start w:w="100" w:type="dxa"/>
+              <w:bottom w:w="80" w:type="dxa"/>
+              <w:end w:w="100" w:type="dxa"/>
+            </w:tcMar>
+          </w:tcPr>
+          <w:p>
+            <w:pPr>
+              <w:spacing w:after="0"/>
+            </w:pPr>
+            <w:r>
+              <w:rPr>
+                <w:rFonts w:ascii="Times New Roman" w:hAnsi="Times New Roman"/>
+                <w:sz w:val="17"/>
+              </w:rPr>
+              <w:t>Task 7</w:t>
+            </w:r>
+          </w:p>
+        </w:tc>
+      </w:tr>
+      <w:tr>
+        <w:tc>
+          <w:tcPr>
+            <w:tcW w:type="dxa" w:w="900"/>
+            <w:vAlign w:val="center"/>
+            <w:tcMar>
+              <w:top w:w="80" w:type="dxa"/>
+              <w:start w:w="100" w:type="dxa"/>
+              <w:bottom w:w="80" w:type="dxa"/>
+              <w:end w:w="100" w:type="dxa"/>
+            </w:tcMar>
+          </w:tcPr>
+          <w:p>
+            <w:pPr>
+              <w:spacing w:after="0"/>
+            </w:pPr>
+            <w:r>
+              <w:rPr>
+                <w:rFonts w:ascii="Times New Roman" w:hAnsi="Times New Roman"/>
+                <w:sz w:val="17"/>
+              </w:rPr>
+              <w:t>PASS</w:t>
+            </w:r>
+          </w:p>
+        </w:tc>
+        <w:tc>
+          <w:tcPr>
+            <w:tcW w:type="dxa" w:w="3400"/>
+            <w:vAlign w:val="center"/>
+            <w:tcMar>
+              <w:top w:w="80" w:type="dxa"/>
+              <w:start w:w="100" w:type="dxa"/>
+              <w:bottom w:w="80" w:type="dxa"/>
+              <w:end w:w="100" w:type="dxa"/>
+            </w:tcMar>
+          </w:tcPr>
+          <w:p>
+            <w:pPr>
+              <w:spacing w:after="0"/>
+            </w:pPr>
+            <w:r>
+              <w:rPr>
+                <w:rFonts w:ascii="Times New Roman" w:hAnsi="Times New Roman"/>
+                <w:sz w:val="17"/>
+              </w:rPr>
+              <w:t>Final report contains AI use declaration</w:t>
+            </w:r>
+          </w:p>
+        </w:tc>
+        <w:tc>
+          <w:tcPr>
+            <w:tcW w:type="dxa" w:w="5060"/>
+            <w:vAlign w:val="center"/>
+            <w:tcMar>
+              <w:top w:w="80" w:type="dxa"/>
+              <w:start w:w="100" w:type="dxa"/>
+              <w:bottom w:w="80" w:type="dxa"/>
+              <w:end w:w="100" w:type="dxa"/>
+            </w:tcMar>
+          </w:tcPr>
+          <w:p>
+            <w:pPr>
+              <w:spacing w:after="0"/>
+            </w:pPr>
+            <w:r>
+              <w:rPr>
+                <w:rFonts w:ascii="Times New Roman" w:hAnsi="Times New Roman"/>
+                <w:sz w:val="17"/>
+              </w:rPr>
+              <w:t>AI use declaration</w:t>
+            </w:r>
+          </w:p>
+        </w:tc>
+      </w:tr>
+      <w:tr>
+        <w:tc>
+          <w:tcPr>
+            <w:tcW w:type="dxa" w:w="900"/>
+            <w:vAlign w:val="center"/>
+            <w:tcMar>
+              <w:top w:w="80" w:type="dxa"/>
+              <w:start w:w="100" w:type="dxa"/>
+              <w:bottom w:w="80" w:type="dxa"/>
+              <w:end w:w="100" w:type="dxa"/>
+            </w:tcMar>
+          </w:tcPr>
+          <w:p>
+            <w:pPr>
+              <w:spacing w:after="0"/>
+            </w:pPr>
+            <w:r>
+              <w:rPr>
+                <w:rFonts w:ascii="Times New Roman" w:hAnsi="Times New Roman"/>
+                <w:sz w:val="17"/>
+              </w:rPr>
+              <w:t>PASS</w:t>
+            </w:r>
+          </w:p>
+        </w:tc>
+        <w:tc>
+          <w:tcPr>
+            <w:tcW w:type="dxa" w:w="3400"/>
+            <w:vAlign w:val="center"/>
+            <w:tcMar>
+              <w:top w:w="80" w:type="dxa"/>
+              <w:start w:w="100" w:type="dxa"/>
+              <w:bottom w:w="80" w:type="dxa"/>
+              <w:end w:w="100" w:type="dxa"/>
+            </w:tcMar>
+          </w:tcPr>
+          <w:p>
+            <w:pPr>
+              <w:spacing w:after="0"/>
+            </w:pPr>
+            <w:r>
+              <w:rPr>
+                <w:rFonts w:ascii="Times New Roman" w:hAnsi="Times New Roman"/>
+                <w:sz w:val="17"/>
+              </w:rPr>
+              <w:t>Development report retains honest dependencies</w:t>
+            </w:r>
+          </w:p>
+        </w:tc>
+        <w:tc>
+          <w:tcPr>
+            <w:tcW w:type="dxa" w:w="5060"/>
+            <w:vAlign w:val="center"/>
+            <w:tcMar>
+              <w:top w:w="80" w:type="dxa"/>
+              <w:start w:w="100" w:type="dxa"/>
+              <w:bottom w:w="80" w:type="dxa"/>
+              <w:end w:w="100" w:type="dxa"/>
+            </w:tcMar>
+          </w:tcPr>
+          <w:p>
+            <w:pPr>
+              <w:spacing w:after="0"/>
+            </w:pPr>
+            <w:r>
+              <w:rPr>
+                <w:rFonts w:ascii="Times New Roman" w:hAnsi="Times New Roman"/>
+                <w:sz w:val="17"/>
+              </w:rPr>
+              <w:t>dependency notices</w:t>
+            </w:r>
+          </w:p>
+        </w:tc>
+      </w:tr>
+      <w:tr>
+        <w:tc>
+          <w:tcPr>
+            <w:tcW w:type="dxa" w:w="900"/>
+            <w:vAlign w:val="center"/>
+            <w:tcMar>
+              <w:top w:w="80" w:type="dxa"/>
+              <w:start w:w="100" w:type="dxa"/>
+              <w:bottom w:w="80" w:type="dxa"/>
+              <w:end w:w="100" w:type="dxa"/>
+            </w:tcMar>
+          </w:tcPr>
+          <w:p>
+            <w:pPr>
+              <w:spacing w:after="0"/>
+            </w:pPr>
+            <w:r>
+              <w:rPr>
+                <w:rFonts w:ascii="Times New Roman" w:hAnsi="Times New Roman"/>
+                <w:sz w:val="17"/>
+              </w:rPr>
+              <w:t>PASS</w:t>
+            </w:r>
+          </w:p>
+        </w:tc>
+        <w:tc>
+          <w:tcPr>
+            <w:tcW w:type="dxa" w:w="3400"/>
+            <w:vAlign w:val="center"/>
+            <w:tcMar>
+              <w:top w:w="80" w:type="dxa"/>
+              <w:start w:w="100" w:type="dxa"/>
+              <w:bottom w:w="80" w:type="dxa"/>
+              <w:end w:w="100" w:type="dxa"/>
+            </w:tcMar>
+          </w:tcPr>
+          <w:p>
+            <w:pPr>
+              <w:spacing w:after="0"/>
+            </w:pPr>
+            <w:r>
+              <w:rPr>
+                <w:rFonts w:ascii="Times New Roman" w:hAnsi="Times New Roman"/>
+                <w:sz w:val="17"/>
+              </w:rPr>
+              <w:t>Development mode honestly retains placeholders</w:t>
+            </w:r>
+          </w:p>
+        </w:tc>
+        <w:tc>
+          <w:tcPr>
+            <w:tcW w:type="dxa" w:w="5060"/>
+            <w:vAlign w:val="center"/>
+            <w:tcMar>
+              <w:top w:w="80" w:type="dxa"/>
+              <w:start w:w="100" w:type="dxa"/>
+              <w:bottom w:w="80" w:type="dxa"/>
+              <w:end w:w="100" w:type="dxa"/>
+            </w:tcMar>
+          </w:tcPr>
+          <w:p>
+            <w:pPr>
+              <w:spacing w:after="0"/>
+            </w:pPr>
+            <w:r>
+              <w:rPr>
+                <w:rFonts w:ascii="Times New Roman" w:hAnsi="Times New Roman"/>
+                <w:sz w:val="17"/>
+              </w:rPr>
+              <w:t>FINAL_MODE=0</w:t>
             </w:r>
           </w:p>
         </w:tc>
@@ -2769,7 +5211,7 @@
           <w:i w:val="0"/>
           <w:sz w:val="24"/>
         </w:rPr>
-        <w:t>Official A2 spreadsheet is not supplied; actual cleaning evidence remains pending.</w:t>
+        <w:t>Official A2 workbook and actual cleaning evidence.</w:t>
       </w:r>
     </w:p>
     <w:p>
@@ -2782,7 +5224,7 @@
           <w:i w:val="0"/>
           <w:sz w:val="24"/>
         </w:rPr>
-        <w:t>Week 11 business scenario is not supplied.</w:t>
+        <w:t>Week 11 assigned business scenario.</w:t>
       </w:r>
     </w:p>
     <w:p>
@@ -2795,7 +5237,33 @@
           <w:i w:val="0"/>
           <w:sz w:val="24"/>
         </w:rPr>
-        <w:t>Final Workbench screenshots, four-person video, genuine prompt logs and peer reviews require student action.</w:t>
+        <w:t>Genuine student Workbench screenshots.</w:t>
+      </w:r>
+    </w:p>
+    <w:p>
+      <w:pPr>
+        <w:widowControl/>
+      </w:pPr>
+      <w:r>
+        <w:rPr>
+          <w:rFonts w:ascii="Times New Roman" w:hAnsi="Times New Roman"/>
+          <w:i w:val="0"/>
+          <w:sz w:val="24"/>
+        </w:rPr>
+        <w:t>Four-person video, genuine contribution data, RiPPlE prompt history and peer reviews.</w:t>
+      </w:r>
+    </w:p>
+    <w:p>
+      <w:pPr>
+        <w:widowControl/>
+      </w:pPr>
+      <w:r>
+        <w:rPr>
+          <w:rFonts w:ascii="Times New Roman" w:hAnsi="Times New Roman"/>
+          <w:i w:val="0"/>
+          <w:sz w:val="24"/>
+        </w:rPr>
+        <w:t>Replacement of member 1 and submission date.</w:t>
       </w:r>
     </w:p>
     <w:p>

</xml_diff>